<commit_message>
feat: implement adaptive fraud detection services and citizen-mobile UI components
</commit_message>
<xml_diff>
--- a/SentinelX_Synopsis_2.docx
+++ b/SentinelX_Synopsis_2.docx
@@ -130,20 +130,7 @@
         <w:jc w:val="center"/>
       </w:pPr>
       <w:r>
-        <w:t>“</w:t>
-      </w:r>
-      <w:proofErr w:type="spellStart"/>
-      <w:proofErr w:type="gramStart"/>
-      <w:r>
-        <w:t>SentinelX</w:t>
-      </w:r>
-      <w:proofErr w:type="spellEnd"/>
-      <w:r>
-        <w:t xml:space="preserve"> :</w:t>
-      </w:r>
-      <w:proofErr w:type="gramEnd"/>
-      <w:r>
-        <w:t xml:space="preserve"> Autonomous Digital Public Safety &amp; Antifraud Architecture”</w:t>
+        <w:t>“SentinelX : Autonomous Digital Public Safety &amp; Antifraud Architecture”</w:t>
       </w:r>
     </w:p>
     <w:p>
@@ -269,12 +256,11 @@
         <w:t>Submitted by:</w:t>
       </w:r>
       <w:r>
+        <w:t xml:space="preserve"> </w:t>
+      </w:r>
+      <w:r>
         <w:br/>
         <w:t>Meet Desai</w:t>
-      </w:r>
-      <w:r>
-        <w:br/>
-        <w:t>Shabdantika Parab</w:t>
       </w:r>
       <w:r>
         <w:br/>
@@ -493,24 +479,22 @@
         </w:rPr>
         <w:t>Mr./Ms.</w:t>
       </w:r>
-    </w:p>
-    <w:p>
-      <w:pPr>
-        <w:pStyle w:val="BodyText"/>
-        <w:spacing w:before="156"/>
-        <w:rPr>
-          <w:sz w:val="24"/>
-        </w:rPr>
-      </w:pPr>
-    </w:p>
-    <w:p>
-      <w:pPr>
-        <w:ind w:left="852"/>
-        <w:rPr>
-          <w:b/>
-          <w:sz w:val="24"/>
-        </w:rPr>
-      </w:pPr>
+      <w:r>
+        <w:rPr>
+          <w:spacing w:val="-2"/>
+          <w:sz w:val="24"/>
+        </w:rPr>
+        <w:t xml:space="preserve"> Meet Desai (), Tanmay </w:t>
+      </w:r>
+      <w:r>
+        <w:t>Changan ()</w:t>
+      </w:r>
+      <w:r>
+        <w:rPr>
+          <w:sz w:val="24"/>
+        </w:rPr>
+        <w:t xml:space="preserve"> </w:t>
+      </w:r>
       <w:r>
         <w:rPr>
           <w:sz w:val="24"/>
@@ -601,18 +585,8 @@
         </w:rPr>
         <w:t>“</w:t>
       </w:r>
-      <w:proofErr w:type="spellStart"/>
-      <w:proofErr w:type="gramStart"/>
-      <w:r>
-        <w:t>SentinelX</w:t>
-      </w:r>
-      <w:proofErr w:type="spellEnd"/>
-      <w:r>
-        <w:t xml:space="preserve"> :</w:t>
-      </w:r>
-      <w:proofErr w:type="gramEnd"/>
-      <w:r>
-        <w:t xml:space="preserve"> Autonomous Digital Public Safety &amp; Antifraud Architecture</w:t>
+      <w:r>
+        <w:t>SentinelX : Autonomous Digital Public Safety &amp; Antifraud Architecture</w:t>
       </w:r>
       <w:r>
         <w:rPr>
@@ -620,15 +594,6 @@
         </w:rPr>
         <w:t>”</w:t>
       </w:r>
-    </w:p>
-    <w:p>
-      <w:pPr>
-        <w:pStyle w:val="BodyText"/>
-        <w:rPr>
-          <w:b/>
-          <w:sz w:val="24"/>
-        </w:rPr>
-      </w:pPr>
     </w:p>
     <w:p>
       <w:pPr>
@@ -733,11 +698,11 @@
           <w:sz w:val="24"/>
         </w:rPr>
         <w:sectPr>
-          <w:headerReference w:type="default" r:id="rId6"/>
-          <w:headerReference w:type="first" r:id="rId7"/>
+          <w:headerReference w:type="default" r:id="rId7"/>
+          <w:headerReference w:type="first" r:id="rId8"/>
           <w:type w:val="continuous"/>
           <w:pgSz w:w="12240" w:h="15840"/>
-          <w:pgMar w:top="1920" w:right="360" w:bottom="280" w:left="0" w:header="0" w:footer="0" w:gutter="0"/>
+          <w:pgMar w:top="1920" w:right="360" w:bottom="280" w:left="567" w:header="0" w:footer="0" w:gutter="0"/>
           <w:pgNumType w:start="1"/>
           <w:cols w:space="720"/>
           <w:titlePg/>
@@ -2163,7 +2128,6 @@
         </w:rPr>
         <w:t xml:space="preserve"> </w:t>
       </w:r>
-      <w:proofErr w:type="gramStart"/>
       <w:r>
         <w:rPr>
           <w:sz w:val="24"/>
@@ -2183,7 +2147,6 @@
         </w:rPr>
         <w:t>for</w:t>
       </w:r>
-      <w:proofErr w:type="gramEnd"/>
       <w:r>
         <w:rPr>
           <w:spacing w:val="-2"/>
@@ -2484,7 +2447,7 @@
         </w:rPr>
         <w:sectPr>
           <w:pgSz w:w="12240" w:h="15840"/>
-          <w:pgMar w:top="1920" w:right="360" w:bottom="280" w:left="0" w:header="674" w:footer="0" w:gutter="0"/>
+          <w:pgMar w:top="1920" w:right="360" w:bottom="280" w:left="567" w:header="674" w:footer="0" w:gutter="0"/>
           <w:cols w:space="720"/>
         </w:sectPr>
       </w:pPr>
@@ -3341,7 +3304,7 @@
         </w:rPr>
         <w:sectPr>
           <w:pgSz w:w="12240" w:h="15840"/>
-          <w:pgMar w:top="1960" w:right="360" w:bottom="280" w:left="0" w:header="674" w:footer="0" w:gutter="0"/>
+          <w:pgMar w:top="1960" w:right="360" w:bottom="280" w:left="567" w:header="674" w:footer="0" w:gutter="0"/>
           <w:cols w:space="720"/>
         </w:sectPr>
       </w:pPr>
@@ -4305,7 +4268,7 @@
         </w:rPr>
         <w:sectPr>
           <w:pgSz w:w="12240" w:h="15840"/>
-          <w:pgMar w:top="1920" w:right="360" w:bottom="280" w:left="0" w:header="674" w:footer="0" w:gutter="0"/>
+          <w:pgMar w:top="1920" w:right="360" w:bottom="280" w:left="567" w:header="674" w:footer="0" w:gutter="0"/>
           <w:cols w:space="720"/>
         </w:sectPr>
       </w:pPr>
@@ -4332,122 +4295,137 @@
     <w:p>
       <w:pPr>
         <w:pStyle w:val="Heading2"/>
+        <w:ind w:left="0"/>
+        <w:jc w:val="both"/>
+      </w:pPr>
+      <w:r>
+        <w:rPr>
+          <w:spacing w:val="-2"/>
+        </w:rPr>
+        <w:t>Abstract:</w:t>
+      </w:r>
+    </w:p>
+    <w:p>
+      <w:pPr>
+        <w:pStyle w:val="BodyText"/>
         <w:ind w:left="567"/>
         <w:jc w:val="both"/>
-      </w:pPr>
-      <w:r>
-        <w:rPr>
-          <w:spacing w:val="-2"/>
-        </w:rPr>
-        <w:t>Abstract:</w:t>
+        <w:rPr>
+          <w:lang w:val="en-IN"/>
+        </w:rPr>
+      </w:pPr>
+      <w:r>
+        <w:rPr>
+          <w:lang w:val="en-IN"/>
+        </w:rPr>
+        <w:t>SentinelX is an AI-powered public safety and antifraud platform designed to detect, analyze, and respond to cyber fraud, suspicious financial activities, digital identity abuse, and public safety threats in real time. The platform combines machine learning, real-time analytics, behavioral analysis, automated risk scoring, and intelligent alerting to identify potentially harmful activities at an early stage. By collecting and analyzing data from multiple sources such as transaction records, security logs, digital activities, and incident reports, SentinelX transforms fragmented information into meaningful security insights. Its intelligent detection engine continuously evaluates patterns and anomalies, assigns risk levels to suspicious events, and generates automated alerts for high-risk activities. This enables organizations to prioritize critical incidents and take faster, data-driven decisions instead of relying entirely on manual monitoring and investigation.</w:t>
       </w:r>
     </w:p>
     <w:p>
       <w:pPr>
         <w:pStyle w:val="BodyText"/>
-        <w:spacing w:before="93"/>
-        <w:ind w:left="851"/>
+        <w:ind w:left="567"/>
         <w:jc w:val="both"/>
         <w:rPr>
-          <w:b/>
-        </w:rPr>
-      </w:pPr>
-      <w:r>
-        <w:t>SentinelX is an AI-powered public safety and antifraud platform that autonomously detects cyber fraud, suspicious financial activity, digital identity abuse, and public safety threats using machine learning, real-time analytics, and automated alerting.</w:t>
-      </w:r>
+          <w:lang w:val="en-IN"/>
+        </w:rPr>
+      </w:pPr>
     </w:p>
     <w:p>
       <w:pPr>
         <w:pStyle w:val="BodyText"/>
-        <w:spacing w:line="249" w:lineRule="auto"/>
-        <w:ind w:left="861" w:right="496"/>
+        <w:ind w:left="567"/>
         <w:jc w:val="both"/>
-      </w:pPr>
-      <w:r>
-        <w:t>The platform bridges the gap between fragmented security logs and action-oriented crisis response. By unifying multi-source telemetry, automated risk scoring, dynamic threat maps, and instant incident escalation, SentinelX empowers law enforcement, financial institutions, and citizens to mitigate digital and physical threats proactively.</w:t>
+        <w:rPr>
+          <w:lang w:val="en-IN"/>
+        </w:rPr>
+      </w:pPr>
+      <w:r>
+        <w:rPr>
+          <w:lang w:val="en-IN"/>
+        </w:rPr>
+        <w:t>SentinelX also provides dynamic threat visualization, centralized incident management, and automated escalation to improve situational awareness and crisis response. Through interactive dashboards and threat maps, authorized users can monitor emerging incidents, identify potential threat hotspots, track suspicious activities, and understand the overall security landscape in real time. The platform is designed to bridge the gap between raw security data and actionable response by ensuring that relevant information reaches the appropriate stakeholders quickly. By integrating artificial intelligence, predictive analytics, geospatial intelligence, and automated incident response into a unified platform, SentinelX aims to shift traditional security operations from a reactive approach to a proactive and intelligence-driven model. The solution can support law enforcement agencies, financial institutions, organizations, and citizens in reducing fraud, identifying threats earlier, improving response times, and strengthening overall digital and public safety.</w:t>
       </w:r>
     </w:p>
     <w:p>
       <w:pPr>
         <w:pStyle w:val="BodyText"/>
         <w:jc w:val="both"/>
-      </w:pPr>
+        <w:rPr>
+          <w:lang w:val="en-IN"/>
+        </w:rPr>
+      </w:pPr>
+    </w:p>
+    <w:p>
+      <w:pPr>
+        <w:pStyle w:val="Heading2"/>
+        <w:ind w:left="0"/>
+        <w:jc w:val="both"/>
+      </w:pPr>
+      <w:r>
+        <w:rPr>
+          <w:spacing w:val="-2"/>
+        </w:rPr>
+        <w:t>Introduction:</w:t>
+      </w:r>
     </w:p>
     <w:p>
       <w:pPr>
         <w:pStyle w:val="BodyText"/>
+        <w:ind w:left="720"/>
         <w:jc w:val="both"/>
-      </w:pPr>
+        <w:rPr>
+          <w:lang w:val="en-IN"/>
+        </w:rPr>
+      </w:pPr>
+      <w:r>
+        <w:rPr>
+          <w:lang w:val="en-IN"/>
+        </w:rPr>
+        <w:t>SentinelX is an AI-powered public safety and antifraud platform that integrates artificial intelligence, cybersecurity, fraud detection, financial intelligence, and public safety monitoring into a unified security ecosystem. The platform is designed to continuously monitor large volumes of digital and operational data to identify suspicious activities, abnormal behavior, fraudulent transactions, cyber threats, and potential public safety incidents. By applying machine learning, behavioral analysis, real-time analytics, and automated risk assessment, SentinelX can detect patterns that may indicate malicious or fraudulent activity. Each detected event can be evaluated and assigned a dynamic risk score based on factors such as severity, frequency, behavioral patterns, transaction activity, location, and historical information. This allows authorized authorities, financial institutions, organizations, and security teams to receive relevant and actionable alerts while focusing their attention on the incidents that require immediate investigation or intervention.</w:t>
+      </w:r>
     </w:p>
     <w:p>
       <w:pPr>
         <w:pStyle w:val="BodyText"/>
-        <w:jc w:val="both"/>
-      </w:pPr>
-    </w:p>
-    <w:p>
-      <w:pPr>
-        <w:pStyle w:val="BodyText"/>
-        <w:jc w:val="both"/>
-      </w:pPr>
-    </w:p>
-    <w:p>
-      <w:pPr>
-        <w:pStyle w:val="BodyText"/>
-        <w:jc w:val="both"/>
-      </w:pPr>
-    </w:p>
-    <w:p>
-      <w:pPr>
-        <w:pStyle w:val="BodyText"/>
-        <w:spacing w:before="316"/>
-        <w:jc w:val="both"/>
-      </w:pPr>
-    </w:p>
-    <w:p>
-      <w:pPr>
-        <w:pStyle w:val="Heading2"/>
         <w:ind w:left="567"/>
         <w:jc w:val="both"/>
-      </w:pPr>
-      <w:r>
-        <w:rPr>
-          <w:spacing w:val="-2"/>
-        </w:rPr>
-        <w:t>Introduction:</w:t>
+        <w:rPr>
+          <w:lang w:val="en-IN"/>
+        </w:rPr>
+      </w:pPr>
+      <w:r>
+        <w:rPr>
+          <w:lang w:val="en-IN"/>
+        </w:rPr>
+        <w:lastRenderedPageBreak/>
+        <w:t>The rapid growth of digital services, online banking, social media, e-commerce, and connected technologies has created new opportunities for cybercriminals and fraudsters. As a result, threats such as phishing campaigns, financial scams, identity theft, account takeovers, malicious transactions, social engineering, and digital identity abuse are becoming increasingly sophisticated and difficult to detect. Traditional security frameworks often depend on multiple siloed systems, static rules, manual investigations, and delayed reporting, which can result in threats being identified only after significant damage has already occurred. SentinelX addresses this challenge through an autonomous, end-to-end architecture capable of processing high-velocity data streams and security events in real time. Instead of simply recording incidents, the platform analyzes incoming information, identifies relationships between events, detects anomalies, calculates risk levels, and generates early warnings. This proactive approach enables stakeholders to investigate suspicious activities at an earlier stage and take appropriate preventive measures before a potential threat develops into a major incident.</w:t>
       </w:r>
     </w:p>
     <w:p>
       <w:pPr>
         <w:pStyle w:val="BodyText"/>
-        <w:spacing w:before="93"/>
-        <w:ind w:left="851"/>
+        <w:ind w:left="720"/>
         <w:jc w:val="both"/>
-      </w:pPr>
-      <w:r>
-        <w:t>SentinelX integrates AI, cybersecurity, fraud detection, and public safety intelligence into a unified platform. It continuously monitors digital activities, detects anomalies, generates risk scores, and provides authorities and organizations with actionable alerts.</w:t>
-      </w:r>
+        <w:rPr>
+          <w:lang w:val="en-IN"/>
+        </w:rPr>
+      </w:pPr>
     </w:p>
     <w:p>
       <w:pPr>
         <w:pStyle w:val="BodyText"/>
-        <w:spacing w:before="93"/>
-        <w:ind w:left="851"/>
+        <w:ind w:left="567"/>
         <w:jc w:val="both"/>
         <w:rPr>
-          <w:b/>
-        </w:rPr>
-      </w:pPr>
-    </w:p>
-    <w:p>
-      <w:pPr>
-        <w:pStyle w:val="BodyText"/>
-        <w:spacing w:before="1" w:line="249" w:lineRule="auto"/>
-        <w:ind w:left="861" w:right="496"/>
-        <w:jc w:val="both"/>
-      </w:pPr>
-      <w:r>
-        <w:t>Rapid digitalization has led to an exponential rise in complex cyber scams, phishing campaigns, identity theft, and financial fraud. Traditional security frameworks often react after damage has occurred due to siloed monitoring systems. SentinelX addresses this challenge by providing an autonomous, end-to-end antifraud and public safety architecture that processes high-velocity data streams in real time, delivering early warnings, automated mitigation strategies, and high-visibility analytics dashboards.</w:t>
+          <w:lang w:val="en-IN"/>
+        </w:rPr>
+      </w:pPr>
+      <w:r>
+        <w:rPr>
+          <w:lang w:val="en-IN"/>
+        </w:rPr>
+        <w:t>Another important aspect of SentinelX is its ability to convert complex security information into clear and actionable intelligence. The platform provides centralized analytics dashboards, real-time incident monitoring, dynamic threat maps, automated notifications, and intelligent escalation mechanisms to improve overall situational awareness. Security personnel can visualize emerging threat patterns, identify high-risk areas, monitor incident activity, and prioritize cases according to their severity and potential impact. By bringing fragmented security logs and multi-source telemetry into a common intelligence layer, SentinelX reduces information gaps and supports faster coordination between relevant stakeholders. The combination of artificial intelligence, predictive analytics, cybersecurity monitoring, fraud detection, geospatial intelligence, and automated alerting enables SentinelX to move beyond traditional reactive security models toward a proactive and intelligence-driven approach. Ultimately, the platform aims to help law enforcement agencies, financial institutions, organizations, and other authorized users detect threats earlier, reduce response times, improve fraud prevention, and strengthen both digital and public safety.</w:t>
       </w:r>
     </w:p>
     <w:p>
@@ -4472,7 +4450,7 @@
     <w:p>
       <w:pPr>
         <w:pStyle w:val="Heading2"/>
-        <w:ind w:left="567"/>
+        <w:ind w:left="0"/>
         <w:jc w:val="both"/>
       </w:pPr>
       <w:r>
@@ -4489,30 +4467,23 @@
           <w:spacing w:val="-2"/>
         </w:rPr>
         <w:t>Statement</w:t>
-      </w:r>
-    </w:p>
-    <w:p>
-      <w:pPr>
-        <w:pStyle w:val="BodyText"/>
-        <w:spacing w:before="46" w:line="247" w:lineRule="auto"/>
-        <w:ind w:left="861" w:right="720"/>
-        <w:jc w:val="both"/>
-      </w:pPr>
-      <w:r>
-        <w:t>Increasing cyber fraud, digital scams, identity theft, and delayed threat detection reduce public safety and financial security.</w:t>
       </w:r>
     </w:p>
     <w:p>
       <w:pPr>
         <w:pStyle w:val="BodyText"/>
         <w:spacing w:line="247" w:lineRule="auto"/>
+        <w:ind w:left="567"/>
         <w:jc w:val="both"/>
         <w:sectPr>
           <w:pgSz w:w="12240" w:h="15840"/>
-          <w:pgMar w:top="2040" w:right="360" w:bottom="280" w:left="0" w:header="674" w:footer="0" w:gutter="0"/>
+          <w:pgMar w:top="2041" w:right="357" w:bottom="278" w:left="567" w:header="675" w:footer="0" w:gutter="0"/>
           <w:cols w:space="720"/>
         </w:sectPr>
       </w:pPr>
+      <w:r>
+        <w:t>The rapid growth of cyber fraud, digital scams, financial crimes, identity theft, and online threats has created significant challenges for public safety and financial security. Existing systems often rely on fragmented monitoring and delayed responses, making early threat detection difficult. There is a need for an intelligent, real-time solution capable of identifying risks and enabling faster intervention.</w:t>
+      </w:r>
     </w:p>
     <w:p>
       <w:pPr>
@@ -4530,7 +4501,7 @@
     <w:p>
       <w:pPr>
         <w:pStyle w:val="Heading2"/>
-        <w:ind w:left="567"/>
+        <w:ind w:left="0"/>
         <w:jc w:val="both"/>
       </w:pPr>
       <w:r>
@@ -4539,34 +4510,43 @@
         </w:rPr>
         <w:t>Solution</w:t>
       </w:r>
-    </w:p>
-    <w:p>
-      <w:pPr>
-        <w:pStyle w:val="BodyText"/>
-        <w:spacing w:before="45" w:line="247" w:lineRule="auto"/>
-        <w:ind w:left="861" w:right="496"/>
-        <w:jc w:val="both"/>
-      </w:pPr>
-      <w:proofErr w:type="spellStart"/>
-      <w:r>
-        <w:t>SentinelX</w:t>
-      </w:r>
-      <w:proofErr w:type="spellEnd"/>
-      <w:r>
-        <w:t xml:space="preserve"> uses AI-driven anomaly detection, behavioral analysis, automated reporting, and secure dashboards to identify and prevent fraud while improving public safety response.</w:t>
-      </w:r>
-    </w:p>
-    <w:p>
-      <w:pPr>
-        <w:pStyle w:val="BodyText"/>
-        <w:spacing w:before="94"/>
-        <w:jc w:val="both"/>
-      </w:pPr>
     </w:p>
     <w:p>
       <w:pPr>
         <w:pStyle w:val="Heading2"/>
         <w:spacing w:before="1" w:after="52"/>
+        <w:ind w:left="720"/>
+        <w:jc w:val="both"/>
+        <w:rPr>
+          <w:b w:val="0"/>
+          <w:bCs w:val="0"/>
+        </w:rPr>
+      </w:pPr>
+      <w:r>
+        <w:rPr>
+          <w:b w:val="0"/>
+          <w:bCs w:val="0"/>
+        </w:rPr>
+        <w:t>SentinelX provides an AI-driven solution that combines anomaly detection, behavioral analysis, real-time risk assessment, automated reporting, and secure dashboards to identify suspicious activities and potential threats at an early stage. By analyzing data from multiple sources, the platform detects unusual patterns, generates risk scores, and automatically alerts authorized users. This enables faster investigation, proactive fraud prevention, and improved public safety response while reducing reliance on manual monitoring.</w:t>
+      </w:r>
+    </w:p>
+    <w:p>
+      <w:pPr>
+        <w:pStyle w:val="Heading2"/>
+        <w:spacing w:before="1" w:after="52"/>
+        <w:ind w:left="0"/>
+        <w:jc w:val="both"/>
+        <w:rPr>
+          <w:b w:val="0"/>
+          <w:bCs w:val="0"/>
+        </w:rPr>
+      </w:pPr>
+    </w:p>
+    <w:p>
+      <w:pPr>
+        <w:pStyle w:val="Heading2"/>
+        <w:spacing w:before="1" w:after="52"/>
+        <w:ind w:left="0"/>
         <w:jc w:val="both"/>
       </w:pPr>
       <w:r>
@@ -4587,7 +4567,7 @@
     </w:p>
     <w:tbl>
       <w:tblPr>
-        <w:tblW w:w="0" w:type="auto"/>
+        <w:tblW w:w="10341" w:type="dxa"/>
         <w:tblInd w:w="881" w:type="dxa"/>
         <w:tblBorders>
           <w:top w:val="single" w:sz="4" w:space="0" w:color="000000"/>
@@ -4605,31 +4585,32 @@
         <w:tblLook w:val="01E0" w:firstRow="1" w:lastRow="1" w:firstColumn="1" w:lastColumn="1" w:noHBand="0" w:noVBand="0"/>
       </w:tblPr>
       <w:tblGrid>
-        <w:gridCol w:w="3027"/>
-        <w:gridCol w:w="360"/>
+        <w:gridCol w:w="3541"/>
+        <w:gridCol w:w="416"/>
+        <w:gridCol w:w="414"/>
+        <w:gridCol w:w="423"/>
+        <w:gridCol w:w="422"/>
         <w:gridCol w:w="358"/>
-        <w:gridCol w:w="358"/>
-        <w:gridCol w:w="358"/>
-        <w:gridCol w:w="310"/>
-        <w:gridCol w:w="315"/>
-        <w:gridCol w:w="313"/>
-        <w:gridCol w:w="311"/>
-        <w:gridCol w:w="287"/>
-        <w:gridCol w:w="417"/>
-        <w:gridCol w:w="415"/>
-        <w:gridCol w:w="393"/>
-        <w:gridCol w:w="393"/>
-        <w:gridCol w:w="395"/>
-        <w:gridCol w:w="393"/>
-        <w:gridCol w:w="392"/>
+        <w:gridCol w:w="369"/>
+        <w:gridCol w:w="362"/>
+        <w:gridCol w:w="371"/>
+        <w:gridCol w:w="332"/>
+        <w:gridCol w:w="485"/>
+        <w:gridCol w:w="482"/>
+        <w:gridCol w:w="470"/>
+        <w:gridCol w:w="462"/>
+        <w:gridCol w:w="458"/>
+        <w:gridCol w:w="462"/>
+        <w:gridCol w:w="455"/>
+        <w:gridCol w:w="59"/>
       </w:tblGrid>
       <w:tr>
         <w:trPr>
-          <w:trHeight w:val="604"/>
+          <w:trHeight w:val="579"/>
         </w:trPr>
         <w:tc>
           <w:tcPr>
-            <w:tcW w:w="3027" w:type="dxa"/>
+            <w:tcW w:w="3544" w:type="dxa"/>
             <w:tcBorders>
               <w:top w:val="nil"/>
               <w:left w:val="nil"/>
@@ -4647,7 +4628,7 @@
         </w:tc>
         <w:tc>
           <w:tcPr>
-            <w:tcW w:w="1434" w:type="dxa"/>
+            <w:tcW w:w="1677" w:type="dxa"/>
             <w:gridSpan w:val="4"/>
           </w:tcPr>
           <w:p>
@@ -4655,7 +4636,7 @@
               <w:pStyle w:val="TableParagraph"/>
               <w:spacing w:before="150"/>
               <w:ind w:left="228"/>
-              <w:jc w:val="both"/>
+              <w:jc w:val="center"/>
               <w:rPr>
                 <w:sz w:val="23"/>
               </w:rPr>
@@ -4665,13 +4646,13 @@
                 <w:spacing w:val="-2"/>
                 <w:sz w:val="23"/>
               </w:rPr>
-              <w:t>JANUARY</w:t>
-            </w:r>
-          </w:p>
-        </w:tc>
-        <w:tc>
-          <w:tcPr>
-            <w:tcW w:w="1249" w:type="dxa"/>
+              <w:t>July</w:t>
+            </w:r>
+          </w:p>
+        </w:tc>
+        <w:tc>
+          <w:tcPr>
+            <w:tcW w:w="1460" w:type="dxa"/>
             <w:gridSpan w:val="4"/>
           </w:tcPr>
           <w:p>
@@ -4679,7 +4660,7 @@
               <w:pStyle w:val="TableParagraph"/>
               <w:spacing w:before="150"/>
               <w:ind w:left="18" w:right="-15"/>
-              <w:jc w:val="both"/>
+              <w:jc w:val="center"/>
               <w:rPr>
                 <w:sz w:val="23"/>
               </w:rPr>
@@ -4689,13 +4670,13 @@
                 <w:spacing w:val="-2"/>
                 <w:sz w:val="23"/>
               </w:rPr>
-              <w:t>FEBRUARY</w:t>
-            </w:r>
-          </w:p>
-        </w:tc>
-        <w:tc>
-          <w:tcPr>
-            <w:tcW w:w="1512" w:type="dxa"/>
+              <w:t>August</w:t>
+            </w:r>
+          </w:p>
+        </w:tc>
+        <w:tc>
+          <w:tcPr>
+            <w:tcW w:w="1769" w:type="dxa"/>
             <w:gridSpan w:val="4"/>
           </w:tcPr>
           <w:p>
@@ -4703,24 +4684,24 @@
               <w:pStyle w:val="TableParagraph"/>
               <w:spacing w:before="160"/>
               <w:ind w:left="387"/>
-              <w:jc w:val="both"/>
-              <w:rPr>
-                <w:rFonts w:ascii="Cambria"/>
-              </w:rPr>
-            </w:pPr>
-            <w:r>
               <w:rPr>
                 <w:rFonts w:ascii="Cambria"/>
                 <w:spacing w:val="-2"/>
               </w:rPr>
-              <w:t>MARCH</w:t>
-            </w:r>
-          </w:p>
-        </w:tc>
-        <w:tc>
-          <w:tcPr>
-            <w:tcW w:w="1573" w:type="dxa"/>
-            <w:gridSpan w:val="4"/>
+            </w:pPr>
+            <w:r>
+              <w:rPr>
+                <w:rFonts w:ascii="Cambria"/>
+                <w:spacing w:val="-2"/>
+              </w:rPr>
+              <w:t>September</w:t>
+            </w:r>
+          </w:p>
+        </w:tc>
+        <w:tc>
+          <w:tcPr>
+            <w:tcW w:w="1891" w:type="dxa"/>
+            <w:gridSpan w:val="5"/>
           </w:tcPr>
           <w:p>
             <w:pPr>
@@ -4737,18 +4718,20 @@
                 <w:spacing w:val="-2"/>
                 <w:sz w:val="23"/>
               </w:rPr>
-              <w:t>APRIL</w:t>
+              <w:t>October</w:t>
             </w:r>
           </w:p>
         </w:tc>
       </w:tr>
       <w:tr>
         <w:trPr>
-          <w:trHeight w:val="955"/>
+          <w:gridAfter w:val="1"/>
+          <w:wAfter w:w="59" w:type="dxa"/>
+          <w:trHeight w:val="918"/>
         </w:trPr>
         <w:tc>
           <w:tcPr>
-            <w:tcW w:w="3027" w:type="dxa"/>
+            <w:tcW w:w="3544" w:type="dxa"/>
           </w:tcPr>
           <w:p>
             <w:pPr>
@@ -4791,7 +4774,7 @@
         </w:tc>
         <w:tc>
           <w:tcPr>
-            <w:tcW w:w="360" w:type="dxa"/>
+            <w:tcW w:w="417" w:type="dxa"/>
             <w:tcBorders>
               <w:bottom w:val="single" w:sz="48" w:space="0" w:color="000000"/>
             </w:tcBorders>
@@ -4813,7 +4796,7 @@
         </w:tc>
         <w:tc>
           <w:tcPr>
-            <w:tcW w:w="358" w:type="dxa"/>
+            <w:tcW w:w="415" w:type="dxa"/>
             <w:tcBorders>
               <w:bottom w:val="single" w:sz="48" w:space="0" w:color="000000"/>
             </w:tcBorders>
@@ -4835,7 +4818,7 @@
         </w:tc>
         <w:tc>
           <w:tcPr>
-            <w:tcW w:w="358" w:type="dxa"/>
+            <w:tcW w:w="422" w:type="dxa"/>
             <w:tcBorders>
               <w:bottom w:val="single" w:sz="48" w:space="0" w:color="000000"/>
               <w:right w:val="single" w:sz="2" w:space="0" w:color="000000"/>
@@ -4858,7 +4841,7 @@
         </w:tc>
         <w:tc>
           <w:tcPr>
-            <w:tcW w:w="358" w:type="dxa"/>
+            <w:tcW w:w="421" w:type="dxa"/>
             <w:tcBorders>
               <w:left w:val="single" w:sz="2" w:space="0" w:color="000000"/>
             </w:tcBorders>
@@ -4880,7 +4863,7 @@
         </w:tc>
         <w:tc>
           <w:tcPr>
-            <w:tcW w:w="310" w:type="dxa"/>
+            <w:tcW w:w="358" w:type="dxa"/>
           </w:tcPr>
           <w:p>
             <w:pPr>
@@ -4899,7 +4882,7 @@
         </w:tc>
         <w:tc>
           <w:tcPr>
-            <w:tcW w:w="315" w:type="dxa"/>
+            <w:tcW w:w="368" w:type="dxa"/>
           </w:tcPr>
           <w:p>
             <w:pPr>
@@ -4918,7 +4901,7 @@
         </w:tc>
         <w:tc>
           <w:tcPr>
-            <w:tcW w:w="313" w:type="dxa"/>
+            <w:tcW w:w="362" w:type="dxa"/>
             <w:tcBorders>
               <w:right w:val="single" w:sz="2" w:space="0" w:color="000000"/>
             </w:tcBorders>
@@ -4940,7 +4923,7 @@
         </w:tc>
         <w:tc>
           <w:tcPr>
-            <w:tcW w:w="311" w:type="dxa"/>
+            <w:tcW w:w="369" w:type="dxa"/>
             <w:tcBorders>
               <w:left w:val="single" w:sz="2" w:space="0" w:color="000000"/>
             </w:tcBorders>
@@ -4962,7 +4945,7 @@
         </w:tc>
         <w:tc>
           <w:tcPr>
-            <w:tcW w:w="287" w:type="dxa"/>
+            <w:tcW w:w="332" w:type="dxa"/>
           </w:tcPr>
           <w:p>
             <w:pPr>
@@ -4981,7 +4964,7 @@
         </w:tc>
         <w:tc>
           <w:tcPr>
-            <w:tcW w:w="417" w:type="dxa"/>
+            <w:tcW w:w="485" w:type="dxa"/>
           </w:tcPr>
           <w:p>
             <w:pPr>
@@ -5000,7 +4983,7 @@
         </w:tc>
         <w:tc>
           <w:tcPr>
-            <w:tcW w:w="415" w:type="dxa"/>
+            <w:tcW w:w="482" w:type="dxa"/>
           </w:tcPr>
           <w:p>
             <w:pPr>
@@ -5019,7 +5002,7 @@
         </w:tc>
         <w:tc>
           <w:tcPr>
-            <w:tcW w:w="393" w:type="dxa"/>
+            <w:tcW w:w="470" w:type="dxa"/>
           </w:tcPr>
           <w:p>
             <w:pPr>
@@ -5038,7 +5021,7 @@
         </w:tc>
         <w:tc>
           <w:tcPr>
-            <w:tcW w:w="393" w:type="dxa"/>
+            <w:tcW w:w="462" w:type="dxa"/>
           </w:tcPr>
           <w:p>
             <w:pPr>
@@ -5057,7 +5040,7 @@
         </w:tc>
         <w:tc>
           <w:tcPr>
-            <w:tcW w:w="395" w:type="dxa"/>
+            <w:tcW w:w="458" w:type="dxa"/>
           </w:tcPr>
           <w:p>
             <w:pPr>
@@ -5076,7 +5059,7 @@
         </w:tc>
         <w:tc>
           <w:tcPr>
-            <w:tcW w:w="393" w:type="dxa"/>
+            <w:tcW w:w="462" w:type="dxa"/>
           </w:tcPr>
           <w:p>
             <w:pPr>
@@ -5095,7 +5078,7 @@
         </w:tc>
         <w:tc>
           <w:tcPr>
-            <w:tcW w:w="392" w:type="dxa"/>
+            <w:tcW w:w="455" w:type="dxa"/>
           </w:tcPr>
           <w:p>
             <w:pPr>
@@ -5115,11 +5098,13 @@
       </w:tr>
       <w:tr>
         <w:trPr>
-          <w:trHeight w:hRule="exact" w:val="10"/>
+          <w:gridAfter w:val="1"/>
+          <w:wAfter w:w="58" w:type="dxa"/>
+          <w:trHeight w:hRule="exact" w:val="5"/>
         </w:trPr>
         <w:tc>
           <w:tcPr>
-            <w:tcW w:w="3027" w:type="dxa"/>
+            <w:tcW w:w="3544" w:type="dxa"/>
             <w:vMerge w:val="restart"/>
           </w:tcPr>
           <w:p>
@@ -5201,7 +5186,7 @@
         </w:tc>
         <w:tc>
           <w:tcPr>
-            <w:tcW w:w="1076" w:type="dxa"/>
+            <w:tcW w:w="1255" w:type="dxa"/>
             <w:gridSpan w:val="3"/>
             <w:tcBorders>
               <w:top w:val="single" w:sz="48" w:space="0" w:color="000000"/>
@@ -5222,44 +5207,110 @@
         </w:tc>
         <w:tc>
           <w:tcPr>
+            <w:tcW w:w="421" w:type="dxa"/>
+            <w:vMerge w:val="restart"/>
+            <w:tcBorders>
+              <w:left w:val="single" w:sz="2" w:space="0" w:color="000000"/>
+              <w:bottom w:val="single" w:sz="48" w:space="0" w:color="000000"/>
+            </w:tcBorders>
+          </w:tcPr>
+          <w:p>
+            <w:pPr>
+              <w:pStyle w:val="TableParagraph"/>
+              <w:jc w:val="both"/>
+              <w:rPr>
+                <w:sz w:val="24"/>
+              </w:rPr>
+            </w:pPr>
+          </w:p>
+        </w:tc>
+        <w:tc>
+          <w:tcPr>
             <w:tcW w:w="358" w:type="dxa"/>
             <w:vMerge w:val="restart"/>
             <w:tcBorders>
+              <w:bottom w:val="single" w:sz="48" w:space="0" w:color="000000"/>
+            </w:tcBorders>
+          </w:tcPr>
+          <w:p>
+            <w:pPr>
+              <w:pStyle w:val="TableParagraph"/>
+              <w:jc w:val="both"/>
+              <w:rPr>
+                <w:sz w:val="24"/>
+              </w:rPr>
+            </w:pPr>
+          </w:p>
+        </w:tc>
+        <w:tc>
+          <w:tcPr>
+            <w:tcW w:w="368" w:type="dxa"/>
+            <w:vMerge w:val="restart"/>
+          </w:tcPr>
+          <w:p>
+            <w:pPr>
+              <w:pStyle w:val="TableParagraph"/>
+              <w:jc w:val="both"/>
+              <w:rPr>
+                <w:sz w:val="24"/>
+              </w:rPr>
+            </w:pPr>
+          </w:p>
+        </w:tc>
+        <w:tc>
+          <w:tcPr>
+            <w:tcW w:w="362" w:type="dxa"/>
+            <w:vMerge w:val="restart"/>
+            <w:tcBorders>
+              <w:right w:val="single" w:sz="2" w:space="0" w:color="000000"/>
+            </w:tcBorders>
+          </w:tcPr>
+          <w:p>
+            <w:pPr>
+              <w:pStyle w:val="TableParagraph"/>
+              <w:jc w:val="both"/>
+              <w:rPr>
+                <w:sz w:val="24"/>
+              </w:rPr>
+            </w:pPr>
+          </w:p>
+        </w:tc>
+        <w:tc>
+          <w:tcPr>
+            <w:tcW w:w="369" w:type="dxa"/>
+            <w:vMerge w:val="restart"/>
+            <w:tcBorders>
               <w:left w:val="single" w:sz="2" w:space="0" w:color="000000"/>
-              <w:bottom w:val="single" w:sz="48" w:space="0" w:color="000000"/>
-            </w:tcBorders>
-          </w:tcPr>
-          <w:p>
-            <w:pPr>
-              <w:pStyle w:val="TableParagraph"/>
-              <w:jc w:val="both"/>
-              <w:rPr>
-                <w:sz w:val="24"/>
-              </w:rPr>
-            </w:pPr>
-          </w:p>
-        </w:tc>
-        <w:tc>
-          <w:tcPr>
-            <w:tcW w:w="310" w:type="dxa"/>
+            </w:tcBorders>
+          </w:tcPr>
+          <w:p>
+            <w:pPr>
+              <w:pStyle w:val="TableParagraph"/>
+              <w:jc w:val="both"/>
+              <w:rPr>
+                <w:sz w:val="24"/>
+              </w:rPr>
+            </w:pPr>
+          </w:p>
+        </w:tc>
+        <w:tc>
+          <w:tcPr>
+            <w:tcW w:w="332" w:type="dxa"/>
             <w:vMerge w:val="restart"/>
-            <w:tcBorders>
-              <w:bottom w:val="single" w:sz="48" w:space="0" w:color="000000"/>
-            </w:tcBorders>
-          </w:tcPr>
-          <w:p>
-            <w:pPr>
-              <w:pStyle w:val="TableParagraph"/>
-              <w:jc w:val="both"/>
-              <w:rPr>
-                <w:sz w:val="24"/>
-              </w:rPr>
-            </w:pPr>
-          </w:p>
-        </w:tc>
-        <w:tc>
-          <w:tcPr>
-            <w:tcW w:w="315" w:type="dxa"/>
+          </w:tcPr>
+          <w:p>
+            <w:pPr>
+              <w:pStyle w:val="TableParagraph"/>
+              <w:jc w:val="both"/>
+              <w:rPr>
+                <w:sz w:val="24"/>
+              </w:rPr>
+            </w:pPr>
+          </w:p>
+        </w:tc>
+        <w:tc>
+          <w:tcPr>
+            <w:tcW w:w="485" w:type="dxa"/>
             <w:vMerge w:val="restart"/>
           </w:tcPr>
           <w:p>
@@ -5274,43 +5325,37 @@
         </w:tc>
         <w:tc>
           <w:tcPr>
-            <w:tcW w:w="313" w:type="dxa"/>
+            <w:tcW w:w="482" w:type="dxa"/>
             <w:vMerge w:val="restart"/>
-            <w:tcBorders>
-              <w:right w:val="single" w:sz="2" w:space="0" w:color="000000"/>
-            </w:tcBorders>
-          </w:tcPr>
-          <w:p>
-            <w:pPr>
-              <w:pStyle w:val="TableParagraph"/>
-              <w:jc w:val="both"/>
-              <w:rPr>
-                <w:sz w:val="24"/>
-              </w:rPr>
-            </w:pPr>
-          </w:p>
-        </w:tc>
-        <w:tc>
-          <w:tcPr>
-            <w:tcW w:w="311" w:type="dxa"/>
+          </w:tcPr>
+          <w:p>
+            <w:pPr>
+              <w:pStyle w:val="TableParagraph"/>
+              <w:jc w:val="both"/>
+              <w:rPr>
+                <w:sz w:val="24"/>
+              </w:rPr>
+            </w:pPr>
+          </w:p>
+        </w:tc>
+        <w:tc>
+          <w:tcPr>
+            <w:tcW w:w="470" w:type="dxa"/>
             <w:vMerge w:val="restart"/>
-            <w:tcBorders>
-              <w:left w:val="single" w:sz="2" w:space="0" w:color="000000"/>
-            </w:tcBorders>
-          </w:tcPr>
-          <w:p>
-            <w:pPr>
-              <w:pStyle w:val="TableParagraph"/>
-              <w:jc w:val="both"/>
-              <w:rPr>
-                <w:sz w:val="24"/>
-              </w:rPr>
-            </w:pPr>
-          </w:p>
-        </w:tc>
-        <w:tc>
-          <w:tcPr>
-            <w:tcW w:w="287" w:type="dxa"/>
+          </w:tcPr>
+          <w:p>
+            <w:pPr>
+              <w:pStyle w:val="TableParagraph"/>
+              <w:jc w:val="both"/>
+              <w:rPr>
+                <w:sz w:val="24"/>
+              </w:rPr>
+            </w:pPr>
+          </w:p>
+        </w:tc>
+        <w:tc>
+          <w:tcPr>
+            <w:tcW w:w="462" w:type="dxa"/>
             <w:vMerge w:val="restart"/>
           </w:tcPr>
           <w:p>
@@ -5325,7 +5370,7 @@
         </w:tc>
         <w:tc>
           <w:tcPr>
-            <w:tcW w:w="417" w:type="dxa"/>
+            <w:tcW w:w="458" w:type="dxa"/>
             <w:vMerge w:val="restart"/>
           </w:tcPr>
           <w:p>
@@ -5340,7 +5385,7 @@
         </w:tc>
         <w:tc>
           <w:tcPr>
-            <w:tcW w:w="415" w:type="dxa"/>
+            <w:tcW w:w="462" w:type="dxa"/>
             <w:vMerge w:val="restart"/>
           </w:tcPr>
           <w:p>
@@ -5355,67 +5400,7 @@
         </w:tc>
         <w:tc>
           <w:tcPr>
-            <w:tcW w:w="393" w:type="dxa"/>
-            <w:vMerge w:val="restart"/>
-          </w:tcPr>
-          <w:p>
-            <w:pPr>
-              <w:pStyle w:val="TableParagraph"/>
-              <w:jc w:val="both"/>
-              <w:rPr>
-                <w:sz w:val="24"/>
-              </w:rPr>
-            </w:pPr>
-          </w:p>
-        </w:tc>
-        <w:tc>
-          <w:tcPr>
-            <w:tcW w:w="393" w:type="dxa"/>
-            <w:vMerge w:val="restart"/>
-          </w:tcPr>
-          <w:p>
-            <w:pPr>
-              <w:pStyle w:val="TableParagraph"/>
-              <w:jc w:val="both"/>
-              <w:rPr>
-                <w:sz w:val="24"/>
-              </w:rPr>
-            </w:pPr>
-          </w:p>
-        </w:tc>
-        <w:tc>
-          <w:tcPr>
-            <w:tcW w:w="395" w:type="dxa"/>
-            <w:vMerge w:val="restart"/>
-          </w:tcPr>
-          <w:p>
-            <w:pPr>
-              <w:pStyle w:val="TableParagraph"/>
-              <w:jc w:val="both"/>
-              <w:rPr>
-                <w:sz w:val="24"/>
-              </w:rPr>
-            </w:pPr>
-          </w:p>
-        </w:tc>
-        <w:tc>
-          <w:tcPr>
-            <w:tcW w:w="393" w:type="dxa"/>
-            <w:vMerge w:val="restart"/>
-          </w:tcPr>
-          <w:p>
-            <w:pPr>
-              <w:pStyle w:val="TableParagraph"/>
-              <w:jc w:val="both"/>
-              <w:rPr>
-                <w:sz w:val="24"/>
-              </w:rPr>
-            </w:pPr>
-          </w:p>
-        </w:tc>
-        <w:tc>
-          <w:tcPr>
-            <w:tcW w:w="392" w:type="dxa"/>
+            <w:tcW w:w="455" w:type="dxa"/>
             <w:vMerge w:val="restart"/>
           </w:tcPr>
           <w:p>
@@ -5431,11 +5416,13 @@
       </w:tr>
       <w:tr>
         <w:trPr>
-          <w:trHeight w:val="238"/>
+          <w:gridAfter w:val="1"/>
+          <w:wAfter w:w="59" w:type="dxa"/>
+          <w:trHeight w:val="224"/>
         </w:trPr>
         <w:tc>
           <w:tcPr>
-            <w:tcW w:w="3027" w:type="dxa"/>
+            <w:tcW w:w="3544" w:type="dxa"/>
             <w:vMerge/>
             <w:tcBorders>
               <w:top w:val="nil"/>
@@ -5453,7 +5440,7 @@
         </w:tc>
         <w:tc>
           <w:tcPr>
-            <w:tcW w:w="360" w:type="dxa"/>
+            <w:tcW w:w="417" w:type="dxa"/>
             <w:tcBorders>
               <w:top w:val="nil"/>
             </w:tcBorders>
@@ -5471,7 +5458,7 @@
         </w:tc>
         <w:tc>
           <w:tcPr>
-            <w:tcW w:w="358" w:type="dxa"/>
+            <w:tcW w:w="415" w:type="dxa"/>
             <w:tcBorders>
               <w:top w:val="nil"/>
             </w:tcBorders>
@@ -5489,7 +5476,7 @@
         </w:tc>
         <w:tc>
           <w:tcPr>
-            <w:tcW w:w="358" w:type="dxa"/>
+            <w:tcW w:w="422" w:type="dxa"/>
             <w:tcBorders>
               <w:top w:val="nil"/>
               <w:bottom w:val="nil"/>
@@ -5509,11 +5496,30 @@
         </w:tc>
         <w:tc>
           <w:tcPr>
+            <w:tcW w:w="421" w:type="dxa"/>
+            <w:vMerge/>
+            <w:tcBorders>
+              <w:top w:val="nil"/>
+              <w:left w:val="single" w:sz="2" w:space="0" w:color="000000"/>
+              <w:bottom w:val="single" w:sz="48" w:space="0" w:color="000000"/>
+            </w:tcBorders>
+          </w:tcPr>
+          <w:p>
+            <w:pPr>
+              <w:jc w:val="both"/>
+              <w:rPr>
+                <w:sz w:val="2"/>
+                <w:szCs w:val="2"/>
+              </w:rPr>
+            </w:pPr>
+          </w:p>
+        </w:tc>
+        <w:tc>
+          <w:tcPr>
             <w:tcW w:w="358" w:type="dxa"/>
             <w:vMerge/>
             <w:tcBorders>
               <w:top w:val="nil"/>
-              <w:left w:val="single" w:sz="2" w:space="0" w:color="000000"/>
               <w:bottom w:val="single" w:sz="48" w:space="0" w:color="000000"/>
             </w:tcBorders>
           </w:tcPr>
@@ -5529,11 +5535,10 @@
         </w:tc>
         <w:tc>
           <w:tcPr>
-            <w:tcW w:w="310" w:type="dxa"/>
+            <w:tcW w:w="368" w:type="dxa"/>
             <w:vMerge/>
             <w:tcBorders>
               <w:top w:val="nil"/>
-              <w:bottom w:val="single" w:sz="48" w:space="0" w:color="000000"/>
             </w:tcBorders>
           </w:tcPr>
           <w:p>
@@ -5548,10 +5553,11 @@
         </w:tc>
         <w:tc>
           <w:tcPr>
-            <w:tcW w:w="315" w:type="dxa"/>
+            <w:tcW w:w="362" w:type="dxa"/>
             <w:vMerge/>
             <w:tcBorders>
               <w:top w:val="nil"/>
+              <w:right w:val="single" w:sz="2" w:space="0" w:color="000000"/>
             </w:tcBorders>
           </w:tcPr>
           <w:p>
@@ -5566,11 +5572,11 @@
         </w:tc>
         <w:tc>
           <w:tcPr>
-            <w:tcW w:w="313" w:type="dxa"/>
+            <w:tcW w:w="369" w:type="dxa"/>
             <w:vMerge/>
             <w:tcBorders>
               <w:top w:val="nil"/>
-              <w:right w:val="single" w:sz="2" w:space="0" w:color="000000"/>
+              <w:left w:val="single" w:sz="2" w:space="0" w:color="000000"/>
             </w:tcBorders>
           </w:tcPr>
           <w:p>
@@ -5585,11 +5591,10 @@
         </w:tc>
         <w:tc>
           <w:tcPr>
-            <w:tcW w:w="311" w:type="dxa"/>
+            <w:tcW w:w="332" w:type="dxa"/>
             <w:vMerge/>
             <w:tcBorders>
               <w:top w:val="nil"/>
-              <w:left w:val="single" w:sz="2" w:space="0" w:color="000000"/>
             </w:tcBorders>
           </w:tcPr>
           <w:p>
@@ -5604,7 +5609,7 @@
         </w:tc>
         <w:tc>
           <w:tcPr>
-            <w:tcW w:w="287" w:type="dxa"/>
+            <w:tcW w:w="485" w:type="dxa"/>
             <w:vMerge/>
             <w:tcBorders>
               <w:top w:val="nil"/>
@@ -5622,7 +5627,7 @@
         </w:tc>
         <w:tc>
           <w:tcPr>
-            <w:tcW w:w="417" w:type="dxa"/>
+            <w:tcW w:w="482" w:type="dxa"/>
             <w:vMerge/>
             <w:tcBorders>
               <w:top w:val="nil"/>
@@ -5640,7 +5645,7 @@
         </w:tc>
         <w:tc>
           <w:tcPr>
-            <w:tcW w:w="415" w:type="dxa"/>
+            <w:tcW w:w="470" w:type="dxa"/>
             <w:vMerge/>
             <w:tcBorders>
               <w:top w:val="nil"/>
@@ -5658,7 +5663,7 @@
         </w:tc>
         <w:tc>
           <w:tcPr>
-            <w:tcW w:w="393" w:type="dxa"/>
+            <w:tcW w:w="462" w:type="dxa"/>
             <w:vMerge/>
             <w:tcBorders>
               <w:top w:val="nil"/>
@@ -5676,7 +5681,7 @@
         </w:tc>
         <w:tc>
           <w:tcPr>
-            <w:tcW w:w="393" w:type="dxa"/>
+            <w:tcW w:w="458" w:type="dxa"/>
             <w:vMerge/>
             <w:tcBorders>
               <w:top w:val="nil"/>
@@ -5694,7 +5699,7 @@
         </w:tc>
         <w:tc>
           <w:tcPr>
-            <w:tcW w:w="395" w:type="dxa"/>
+            <w:tcW w:w="462" w:type="dxa"/>
             <w:vMerge/>
             <w:tcBorders>
               <w:top w:val="nil"/>
@@ -5712,25 +5717,7 @@
         </w:tc>
         <w:tc>
           <w:tcPr>
-            <w:tcW w:w="393" w:type="dxa"/>
-            <w:vMerge/>
-            <w:tcBorders>
-              <w:top w:val="nil"/>
-            </w:tcBorders>
-          </w:tcPr>
-          <w:p>
-            <w:pPr>
-              <w:jc w:val="both"/>
-              <w:rPr>
-                <w:sz w:val="2"/>
-                <w:szCs w:val="2"/>
-              </w:rPr>
-            </w:pPr>
-          </w:p>
-        </w:tc>
-        <w:tc>
-          <w:tcPr>
-            <w:tcW w:w="392" w:type="dxa"/>
+            <w:tcW w:w="455" w:type="dxa"/>
             <w:vMerge/>
             <w:tcBorders>
               <w:top w:val="nil"/>
@@ -5749,11 +5736,13 @@
       </w:tr>
       <w:tr>
         <w:trPr>
-          <w:trHeight w:hRule="exact" w:val="10"/>
+          <w:gridAfter w:val="1"/>
+          <w:wAfter w:w="57" w:type="dxa"/>
+          <w:trHeight w:hRule="exact" w:val="5"/>
         </w:trPr>
         <w:tc>
           <w:tcPr>
-            <w:tcW w:w="3027" w:type="dxa"/>
+            <w:tcW w:w="3544" w:type="dxa"/>
             <w:vMerge w:val="restart"/>
           </w:tcPr>
           <w:p>
@@ -5803,125 +5792,6 @@
         </w:tc>
         <w:tc>
           <w:tcPr>
-            <w:tcW w:w="360" w:type="dxa"/>
-            <w:vMerge w:val="restart"/>
-          </w:tcPr>
-          <w:p>
-            <w:pPr>
-              <w:pStyle w:val="TableParagraph"/>
-              <w:jc w:val="both"/>
-              <w:rPr>
-                <w:sz w:val="24"/>
-              </w:rPr>
-            </w:pPr>
-          </w:p>
-        </w:tc>
-        <w:tc>
-          <w:tcPr>
-            <w:tcW w:w="358" w:type="dxa"/>
-            <w:vMerge w:val="restart"/>
-          </w:tcPr>
-          <w:p>
-            <w:pPr>
-              <w:pStyle w:val="TableParagraph"/>
-              <w:jc w:val="both"/>
-              <w:rPr>
-                <w:sz w:val="24"/>
-              </w:rPr>
-            </w:pPr>
-          </w:p>
-        </w:tc>
-        <w:tc>
-          <w:tcPr>
-            <w:tcW w:w="1026" w:type="dxa"/>
-            <w:gridSpan w:val="3"/>
-            <w:tcBorders>
-              <w:top w:val="nil"/>
-              <w:bottom w:val="nil"/>
-            </w:tcBorders>
-            <w:shd w:val="clear" w:color="auto" w:fill="000000"/>
-          </w:tcPr>
-          <w:p>
-            <w:pPr>
-              <w:pStyle w:val="TableParagraph"/>
-              <w:jc w:val="both"/>
-              <w:rPr>
-                <w:sz w:val="2"/>
-              </w:rPr>
-            </w:pPr>
-          </w:p>
-        </w:tc>
-        <w:tc>
-          <w:tcPr>
-            <w:tcW w:w="315" w:type="dxa"/>
-            <w:vMerge w:val="restart"/>
-            <w:tcBorders>
-              <w:bottom w:val="single" w:sz="48" w:space="0" w:color="000000"/>
-            </w:tcBorders>
-          </w:tcPr>
-          <w:p>
-            <w:pPr>
-              <w:pStyle w:val="TableParagraph"/>
-              <w:jc w:val="both"/>
-              <w:rPr>
-                <w:sz w:val="24"/>
-              </w:rPr>
-            </w:pPr>
-          </w:p>
-        </w:tc>
-        <w:tc>
-          <w:tcPr>
-            <w:tcW w:w="313" w:type="dxa"/>
-            <w:vMerge w:val="restart"/>
-            <w:tcBorders>
-              <w:right w:val="single" w:sz="2" w:space="0" w:color="000000"/>
-            </w:tcBorders>
-          </w:tcPr>
-          <w:p>
-            <w:pPr>
-              <w:pStyle w:val="TableParagraph"/>
-              <w:jc w:val="both"/>
-              <w:rPr>
-                <w:sz w:val="24"/>
-              </w:rPr>
-            </w:pPr>
-          </w:p>
-        </w:tc>
-        <w:tc>
-          <w:tcPr>
-            <w:tcW w:w="311" w:type="dxa"/>
-            <w:vMerge w:val="restart"/>
-            <w:tcBorders>
-              <w:left w:val="single" w:sz="2" w:space="0" w:color="000000"/>
-            </w:tcBorders>
-          </w:tcPr>
-          <w:p>
-            <w:pPr>
-              <w:pStyle w:val="TableParagraph"/>
-              <w:jc w:val="both"/>
-              <w:rPr>
-                <w:sz w:val="24"/>
-              </w:rPr>
-            </w:pPr>
-          </w:p>
-        </w:tc>
-        <w:tc>
-          <w:tcPr>
-            <w:tcW w:w="287" w:type="dxa"/>
-            <w:vMerge w:val="restart"/>
-          </w:tcPr>
-          <w:p>
-            <w:pPr>
-              <w:pStyle w:val="TableParagraph"/>
-              <w:jc w:val="both"/>
-              <w:rPr>
-                <w:sz w:val="24"/>
-              </w:rPr>
-            </w:pPr>
-          </w:p>
-        </w:tc>
-        <w:tc>
-          <w:tcPr>
             <w:tcW w:w="417" w:type="dxa"/>
             <w:vMerge w:val="restart"/>
           </w:tcPr>
@@ -5952,52 +5822,81 @@
         </w:tc>
         <w:tc>
           <w:tcPr>
-            <w:tcW w:w="393" w:type="dxa"/>
+            <w:tcW w:w="1203" w:type="dxa"/>
+            <w:gridSpan w:val="3"/>
+            <w:tcBorders>
+              <w:top w:val="nil"/>
+              <w:bottom w:val="nil"/>
+            </w:tcBorders>
+            <w:shd w:val="clear" w:color="auto" w:fill="000000"/>
+          </w:tcPr>
+          <w:p>
+            <w:pPr>
+              <w:pStyle w:val="TableParagraph"/>
+              <w:jc w:val="both"/>
+              <w:rPr>
+                <w:sz w:val="2"/>
+              </w:rPr>
+            </w:pPr>
+          </w:p>
+        </w:tc>
+        <w:tc>
+          <w:tcPr>
+            <w:tcW w:w="368" w:type="dxa"/>
             <w:vMerge w:val="restart"/>
-          </w:tcPr>
-          <w:p>
-            <w:pPr>
-              <w:pStyle w:val="TableParagraph"/>
-              <w:jc w:val="both"/>
-              <w:rPr>
-                <w:sz w:val="24"/>
-              </w:rPr>
-            </w:pPr>
-          </w:p>
-        </w:tc>
-        <w:tc>
-          <w:tcPr>
-            <w:tcW w:w="393" w:type="dxa"/>
+            <w:tcBorders>
+              <w:bottom w:val="single" w:sz="48" w:space="0" w:color="000000"/>
+            </w:tcBorders>
+          </w:tcPr>
+          <w:p>
+            <w:pPr>
+              <w:pStyle w:val="TableParagraph"/>
+              <w:jc w:val="both"/>
+              <w:rPr>
+                <w:sz w:val="24"/>
+              </w:rPr>
+            </w:pPr>
+          </w:p>
+        </w:tc>
+        <w:tc>
+          <w:tcPr>
+            <w:tcW w:w="362" w:type="dxa"/>
             <w:vMerge w:val="restart"/>
-          </w:tcPr>
-          <w:p>
-            <w:pPr>
-              <w:pStyle w:val="TableParagraph"/>
-              <w:jc w:val="both"/>
-              <w:rPr>
-                <w:sz w:val="24"/>
-              </w:rPr>
-            </w:pPr>
-          </w:p>
-        </w:tc>
-        <w:tc>
-          <w:tcPr>
-            <w:tcW w:w="395" w:type="dxa"/>
+            <w:tcBorders>
+              <w:right w:val="single" w:sz="2" w:space="0" w:color="000000"/>
+            </w:tcBorders>
+          </w:tcPr>
+          <w:p>
+            <w:pPr>
+              <w:pStyle w:val="TableParagraph"/>
+              <w:jc w:val="both"/>
+              <w:rPr>
+                <w:sz w:val="24"/>
+              </w:rPr>
+            </w:pPr>
+          </w:p>
+        </w:tc>
+        <w:tc>
+          <w:tcPr>
+            <w:tcW w:w="369" w:type="dxa"/>
             <w:vMerge w:val="restart"/>
-          </w:tcPr>
-          <w:p>
-            <w:pPr>
-              <w:pStyle w:val="TableParagraph"/>
-              <w:jc w:val="both"/>
-              <w:rPr>
-                <w:sz w:val="24"/>
-              </w:rPr>
-            </w:pPr>
-          </w:p>
-        </w:tc>
-        <w:tc>
-          <w:tcPr>
-            <w:tcW w:w="393" w:type="dxa"/>
+            <w:tcBorders>
+              <w:left w:val="single" w:sz="2" w:space="0" w:color="000000"/>
+            </w:tcBorders>
+          </w:tcPr>
+          <w:p>
+            <w:pPr>
+              <w:pStyle w:val="TableParagraph"/>
+              <w:jc w:val="both"/>
+              <w:rPr>
+                <w:sz w:val="24"/>
+              </w:rPr>
+            </w:pPr>
+          </w:p>
+        </w:tc>
+        <w:tc>
+          <w:tcPr>
+            <w:tcW w:w="332" w:type="dxa"/>
             <w:vMerge w:val="restart"/>
           </w:tcPr>
           <w:p>
@@ -6012,7 +5911,97 @@
         </w:tc>
         <w:tc>
           <w:tcPr>
-            <w:tcW w:w="392" w:type="dxa"/>
+            <w:tcW w:w="485" w:type="dxa"/>
+            <w:vMerge w:val="restart"/>
+          </w:tcPr>
+          <w:p>
+            <w:pPr>
+              <w:pStyle w:val="TableParagraph"/>
+              <w:jc w:val="both"/>
+              <w:rPr>
+                <w:sz w:val="24"/>
+              </w:rPr>
+            </w:pPr>
+          </w:p>
+        </w:tc>
+        <w:tc>
+          <w:tcPr>
+            <w:tcW w:w="482" w:type="dxa"/>
+            <w:vMerge w:val="restart"/>
+          </w:tcPr>
+          <w:p>
+            <w:pPr>
+              <w:pStyle w:val="TableParagraph"/>
+              <w:jc w:val="both"/>
+              <w:rPr>
+                <w:sz w:val="24"/>
+              </w:rPr>
+            </w:pPr>
+          </w:p>
+        </w:tc>
+        <w:tc>
+          <w:tcPr>
+            <w:tcW w:w="470" w:type="dxa"/>
+            <w:vMerge w:val="restart"/>
+          </w:tcPr>
+          <w:p>
+            <w:pPr>
+              <w:pStyle w:val="TableParagraph"/>
+              <w:jc w:val="both"/>
+              <w:rPr>
+                <w:sz w:val="24"/>
+              </w:rPr>
+            </w:pPr>
+          </w:p>
+        </w:tc>
+        <w:tc>
+          <w:tcPr>
+            <w:tcW w:w="462" w:type="dxa"/>
+            <w:vMerge w:val="restart"/>
+          </w:tcPr>
+          <w:p>
+            <w:pPr>
+              <w:pStyle w:val="TableParagraph"/>
+              <w:jc w:val="both"/>
+              <w:rPr>
+                <w:sz w:val="24"/>
+              </w:rPr>
+            </w:pPr>
+          </w:p>
+        </w:tc>
+        <w:tc>
+          <w:tcPr>
+            <w:tcW w:w="458" w:type="dxa"/>
+            <w:vMerge w:val="restart"/>
+          </w:tcPr>
+          <w:p>
+            <w:pPr>
+              <w:pStyle w:val="TableParagraph"/>
+              <w:jc w:val="both"/>
+              <w:rPr>
+                <w:sz w:val="24"/>
+              </w:rPr>
+            </w:pPr>
+          </w:p>
+        </w:tc>
+        <w:tc>
+          <w:tcPr>
+            <w:tcW w:w="462" w:type="dxa"/>
+            <w:vMerge w:val="restart"/>
+          </w:tcPr>
+          <w:p>
+            <w:pPr>
+              <w:pStyle w:val="TableParagraph"/>
+              <w:jc w:val="both"/>
+              <w:rPr>
+                <w:sz w:val="24"/>
+              </w:rPr>
+            </w:pPr>
+          </w:p>
+        </w:tc>
+        <w:tc>
+          <w:tcPr>
+            <w:tcW w:w="455" w:type="dxa"/>
             <w:vMerge w:val="restart"/>
           </w:tcPr>
           <w:p>
@@ -6028,11 +6017,13 @@
       </w:tr>
       <w:tr>
         <w:trPr>
-          <w:trHeight w:val="769"/>
+          <w:gridAfter w:val="1"/>
+          <w:wAfter w:w="59" w:type="dxa"/>
+          <w:trHeight w:val="738"/>
         </w:trPr>
         <w:tc>
           <w:tcPr>
-            <w:tcW w:w="3027" w:type="dxa"/>
+            <w:tcW w:w="3544" w:type="dxa"/>
             <w:vMerge/>
             <w:tcBorders>
               <w:top w:val="nil"/>
@@ -6050,7 +6041,7 @@
         </w:tc>
         <w:tc>
           <w:tcPr>
-            <w:tcW w:w="360" w:type="dxa"/>
+            <w:tcW w:w="417" w:type="dxa"/>
             <w:vMerge/>
             <w:tcBorders>
               <w:top w:val="nil"/>
@@ -6068,7 +6059,7 @@
         </w:tc>
         <w:tc>
           <w:tcPr>
-            <w:tcW w:w="358" w:type="dxa"/>
+            <w:tcW w:w="415" w:type="dxa"/>
             <w:vMerge/>
             <w:tcBorders>
               <w:top w:val="nil"/>
@@ -6086,7 +6077,7 @@
         </w:tc>
         <w:tc>
           <w:tcPr>
-            <w:tcW w:w="358" w:type="dxa"/>
+            <w:tcW w:w="422" w:type="dxa"/>
             <w:tcBorders>
               <w:top w:val="nil"/>
               <w:right w:val="single" w:sz="2" w:space="0" w:color="000000"/>
@@ -6105,7 +6096,7 @@
         </w:tc>
         <w:tc>
           <w:tcPr>
-            <w:tcW w:w="358" w:type="dxa"/>
+            <w:tcW w:w="421" w:type="dxa"/>
             <w:tcBorders>
               <w:top w:val="nil"/>
               <w:left w:val="single" w:sz="2" w:space="0" w:color="000000"/>
@@ -6125,7 +6116,7 @@
         </w:tc>
         <w:tc>
           <w:tcPr>
-            <w:tcW w:w="310" w:type="dxa"/>
+            <w:tcW w:w="358" w:type="dxa"/>
             <w:tcBorders>
               <w:top w:val="nil"/>
               <w:bottom w:val="nil"/>
@@ -6144,7 +6135,7 @@
         </w:tc>
         <w:tc>
           <w:tcPr>
-            <w:tcW w:w="315" w:type="dxa"/>
+            <w:tcW w:w="368" w:type="dxa"/>
             <w:vMerge/>
             <w:tcBorders>
               <w:top w:val="nil"/>
@@ -6163,7 +6154,7 @@
         </w:tc>
         <w:tc>
           <w:tcPr>
-            <w:tcW w:w="313" w:type="dxa"/>
+            <w:tcW w:w="362" w:type="dxa"/>
             <w:vMerge/>
             <w:tcBorders>
               <w:top w:val="nil"/>
@@ -6182,7 +6173,7 @@
         </w:tc>
         <w:tc>
           <w:tcPr>
-            <w:tcW w:w="311" w:type="dxa"/>
+            <w:tcW w:w="369" w:type="dxa"/>
             <w:vMerge/>
             <w:tcBorders>
               <w:top w:val="nil"/>
@@ -6201,7 +6192,7 @@
         </w:tc>
         <w:tc>
           <w:tcPr>
-            <w:tcW w:w="287" w:type="dxa"/>
+            <w:tcW w:w="332" w:type="dxa"/>
             <w:vMerge/>
             <w:tcBorders>
               <w:top w:val="nil"/>
@@ -6219,7 +6210,7 @@
         </w:tc>
         <w:tc>
           <w:tcPr>
-            <w:tcW w:w="417" w:type="dxa"/>
+            <w:tcW w:w="485" w:type="dxa"/>
             <w:vMerge/>
             <w:tcBorders>
               <w:top w:val="nil"/>
@@ -6237,7 +6228,7 @@
         </w:tc>
         <w:tc>
           <w:tcPr>
-            <w:tcW w:w="415" w:type="dxa"/>
+            <w:tcW w:w="482" w:type="dxa"/>
             <w:vMerge/>
             <w:tcBorders>
               <w:top w:val="nil"/>
@@ -6255,7 +6246,7 @@
         </w:tc>
         <w:tc>
           <w:tcPr>
-            <w:tcW w:w="393" w:type="dxa"/>
+            <w:tcW w:w="470" w:type="dxa"/>
             <w:vMerge/>
             <w:tcBorders>
               <w:top w:val="nil"/>
@@ -6273,7 +6264,7 @@
         </w:tc>
         <w:tc>
           <w:tcPr>
-            <w:tcW w:w="393" w:type="dxa"/>
+            <w:tcW w:w="462" w:type="dxa"/>
             <w:vMerge/>
             <w:tcBorders>
               <w:top w:val="nil"/>
@@ -6291,7 +6282,7 @@
         </w:tc>
         <w:tc>
           <w:tcPr>
-            <w:tcW w:w="395" w:type="dxa"/>
+            <w:tcW w:w="458" w:type="dxa"/>
             <w:vMerge/>
             <w:tcBorders>
               <w:top w:val="nil"/>
@@ -6309,7 +6300,7 @@
         </w:tc>
         <w:tc>
           <w:tcPr>
-            <w:tcW w:w="393" w:type="dxa"/>
+            <w:tcW w:w="462" w:type="dxa"/>
             <w:vMerge/>
             <w:tcBorders>
               <w:top w:val="nil"/>
@@ -6327,7 +6318,7 @@
         </w:tc>
         <w:tc>
           <w:tcPr>
-            <w:tcW w:w="392" w:type="dxa"/>
+            <w:tcW w:w="455" w:type="dxa"/>
             <w:vMerge/>
             <w:tcBorders>
               <w:top w:val="nil"/>
@@ -6346,11 +6337,13 @@
       </w:tr>
       <w:tr>
         <w:trPr>
-          <w:trHeight w:hRule="exact" w:val="10"/>
+          <w:gridAfter w:val="1"/>
+          <w:wAfter w:w="57" w:type="dxa"/>
+          <w:trHeight w:hRule="exact" w:val="5"/>
         </w:trPr>
         <w:tc>
           <w:tcPr>
-            <w:tcW w:w="3027" w:type="dxa"/>
+            <w:tcW w:w="3544" w:type="dxa"/>
             <w:vMerge w:val="restart"/>
           </w:tcPr>
           <w:p>
@@ -6419,7 +6412,7 @@
         </w:tc>
         <w:tc>
           <w:tcPr>
-            <w:tcW w:w="360" w:type="dxa"/>
+            <w:tcW w:w="417" w:type="dxa"/>
             <w:vMerge w:val="restart"/>
           </w:tcPr>
           <w:p>
@@ -6434,7 +6427,7 @@
         </w:tc>
         <w:tc>
           <w:tcPr>
-            <w:tcW w:w="358" w:type="dxa"/>
+            <w:tcW w:w="415" w:type="dxa"/>
             <w:vMerge w:val="restart"/>
           </w:tcPr>
           <w:p>
@@ -6449,7 +6442,7 @@
         </w:tc>
         <w:tc>
           <w:tcPr>
-            <w:tcW w:w="358" w:type="dxa"/>
+            <w:tcW w:w="422" w:type="dxa"/>
             <w:vMerge w:val="restart"/>
             <w:tcBorders>
               <w:right w:val="single" w:sz="2" w:space="0" w:color="000000"/>
@@ -6467,7 +6460,7 @@
         </w:tc>
         <w:tc>
           <w:tcPr>
-            <w:tcW w:w="983" w:type="dxa"/>
+            <w:tcW w:w="1149" w:type="dxa"/>
             <w:gridSpan w:val="3"/>
             <w:tcBorders>
               <w:top w:val="nil"/>
@@ -6488,7 +6481,7 @@
         </w:tc>
         <w:tc>
           <w:tcPr>
-            <w:tcW w:w="313" w:type="dxa"/>
+            <w:tcW w:w="362" w:type="dxa"/>
             <w:vMerge w:val="restart"/>
             <w:tcBorders>
               <w:bottom w:val="single" w:sz="48" w:space="0" w:color="000000"/>
@@ -6507,7 +6500,7 @@
         </w:tc>
         <w:tc>
           <w:tcPr>
-            <w:tcW w:w="311" w:type="dxa"/>
+            <w:tcW w:w="369" w:type="dxa"/>
             <w:vMerge w:val="restart"/>
             <w:tcBorders>
               <w:left w:val="single" w:sz="2" w:space="0" w:color="000000"/>
@@ -6526,7 +6519,7 @@
         </w:tc>
         <w:tc>
           <w:tcPr>
-            <w:tcW w:w="287" w:type="dxa"/>
+            <w:tcW w:w="332" w:type="dxa"/>
             <w:vMerge w:val="restart"/>
             <w:tcBorders>
               <w:bottom w:val="single" w:sz="48" w:space="0" w:color="000000"/>
@@ -6544,7 +6537,7 @@
         </w:tc>
         <w:tc>
           <w:tcPr>
-            <w:tcW w:w="417" w:type="dxa"/>
+            <w:tcW w:w="485" w:type="dxa"/>
             <w:vMerge w:val="restart"/>
             <w:tcBorders>
               <w:bottom w:val="single" w:sz="48" w:space="0" w:color="000000"/>
@@ -6562,7 +6555,7 @@
         </w:tc>
         <w:tc>
           <w:tcPr>
-            <w:tcW w:w="415" w:type="dxa"/>
+            <w:tcW w:w="482" w:type="dxa"/>
             <w:vMerge w:val="restart"/>
             <w:tcBorders>
               <w:bottom w:val="single" w:sz="48" w:space="0" w:color="000000"/>
@@ -6580,7 +6573,7 @@
         </w:tc>
         <w:tc>
           <w:tcPr>
-            <w:tcW w:w="393" w:type="dxa"/>
+            <w:tcW w:w="470" w:type="dxa"/>
             <w:vMerge w:val="restart"/>
             <w:tcBorders>
               <w:bottom w:val="single" w:sz="48" w:space="0" w:color="000000"/>
@@ -6598,7 +6591,7 @@
         </w:tc>
         <w:tc>
           <w:tcPr>
-            <w:tcW w:w="393" w:type="dxa"/>
+            <w:tcW w:w="462" w:type="dxa"/>
             <w:vMerge w:val="restart"/>
             <w:tcBorders>
               <w:bottom w:val="single" w:sz="48" w:space="0" w:color="000000"/>
@@ -6616,7 +6609,7 @@
         </w:tc>
         <w:tc>
           <w:tcPr>
-            <w:tcW w:w="395" w:type="dxa"/>
+            <w:tcW w:w="458" w:type="dxa"/>
             <w:vMerge w:val="restart"/>
           </w:tcPr>
           <w:p>
@@ -6631,7 +6624,7 @@
         </w:tc>
         <w:tc>
           <w:tcPr>
-            <w:tcW w:w="393" w:type="dxa"/>
+            <w:tcW w:w="462" w:type="dxa"/>
             <w:vMerge w:val="restart"/>
           </w:tcPr>
           <w:p>
@@ -6646,7 +6639,7 @@
         </w:tc>
         <w:tc>
           <w:tcPr>
-            <w:tcW w:w="392" w:type="dxa"/>
+            <w:tcW w:w="455" w:type="dxa"/>
             <w:vMerge w:val="restart"/>
           </w:tcPr>
           <w:p>
@@ -6662,11 +6655,13 @@
       </w:tr>
       <w:tr>
         <w:trPr>
-          <w:trHeight w:val="841"/>
+          <w:gridAfter w:val="1"/>
+          <w:wAfter w:w="59" w:type="dxa"/>
+          <w:trHeight w:val="807"/>
         </w:trPr>
         <w:tc>
           <w:tcPr>
-            <w:tcW w:w="3027" w:type="dxa"/>
+            <w:tcW w:w="3544" w:type="dxa"/>
             <w:vMerge/>
             <w:tcBorders>
               <w:top w:val="nil"/>
@@ -6684,7 +6679,7 @@
         </w:tc>
         <w:tc>
           <w:tcPr>
-            <w:tcW w:w="360" w:type="dxa"/>
+            <w:tcW w:w="417" w:type="dxa"/>
             <w:vMerge/>
             <w:tcBorders>
               <w:top w:val="nil"/>
@@ -6702,7 +6697,7 @@
         </w:tc>
         <w:tc>
           <w:tcPr>
-            <w:tcW w:w="358" w:type="dxa"/>
+            <w:tcW w:w="415" w:type="dxa"/>
             <w:vMerge/>
             <w:tcBorders>
               <w:top w:val="nil"/>
@@ -6720,7 +6715,7 @@
         </w:tc>
         <w:tc>
           <w:tcPr>
-            <w:tcW w:w="358" w:type="dxa"/>
+            <w:tcW w:w="422" w:type="dxa"/>
             <w:vMerge/>
             <w:tcBorders>
               <w:top w:val="nil"/>
@@ -6739,10 +6734,28 @@
         </w:tc>
         <w:tc>
           <w:tcPr>
+            <w:tcW w:w="421" w:type="dxa"/>
+            <w:tcBorders>
+              <w:top w:val="nil"/>
+              <w:left w:val="single" w:sz="2" w:space="0" w:color="000000"/>
+            </w:tcBorders>
+            <w:shd w:val="clear" w:color="auto" w:fill="FFD966"/>
+          </w:tcPr>
+          <w:p>
+            <w:pPr>
+              <w:pStyle w:val="TableParagraph"/>
+              <w:jc w:val="both"/>
+              <w:rPr>
+                <w:sz w:val="24"/>
+              </w:rPr>
+            </w:pPr>
+          </w:p>
+        </w:tc>
+        <w:tc>
+          <w:tcPr>
             <w:tcW w:w="358" w:type="dxa"/>
             <w:tcBorders>
               <w:top w:val="nil"/>
-              <w:left w:val="single" w:sz="2" w:space="0" w:color="000000"/>
             </w:tcBorders>
             <w:shd w:val="clear" w:color="auto" w:fill="FFD966"/>
           </w:tcPr>
@@ -6758,9 +6771,10 @@
         </w:tc>
         <w:tc>
           <w:tcPr>
-            <w:tcW w:w="310" w:type="dxa"/>
-            <w:tcBorders>
-              <w:top w:val="nil"/>
+            <w:tcW w:w="368" w:type="dxa"/>
+            <w:tcBorders>
+              <w:top w:val="nil"/>
+              <w:bottom w:val="nil"/>
             </w:tcBorders>
             <w:shd w:val="clear" w:color="auto" w:fill="FFD966"/>
           </w:tcPr>
@@ -6776,26 +6790,7 @@
         </w:tc>
         <w:tc>
           <w:tcPr>
-            <w:tcW w:w="315" w:type="dxa"/>
-            <w:tcBorders>
-              <w:top w:val="nil"/>
-              <w:bottom w:val="nil"/>
-            </w:tcBorders>
-            <w:shd w:val="clear" w:color="auto" w:fill="FFD966"/>
-          </w:tcPr>
-          <w:p>
-            <w:pPr>
-              <w:pStyle w:val="TableParagraph"/>
-              <w:jc w:val="both"/>
-              <w:rPr>
-                <w:sz w:val="24"/>
-              </w:rPr>
-            </w:pPr>
-          </w:p>
-        </w:tc>
-        <w:tc>
-          <w:tcPr>
-            <w:tcW w:w="313" w:type="dxa"/>
+            <w:tcW w:w="362" w:type="dxa"/>
             <w:vMerge/>
             <w:tcBorders>
               <w:top w:val="nil"/>
@@ -6815,7 +6810,7 @@
         </w:tc>
         <w:tc>
           <w:tcPr>
-            <w:tcW w:w="311" w:type="dxa"/>
+            <w:tcW w:w="369" w:type="dxa"/>
             <w:vMerge/>
             <w:tcBorders>
               <w:top w:val="nil"/>
@@ -6835,7 +6830,7 @@
         </w:tc>
         <w:tc>
           <w:tcPr>
-            <w:tcW w:w="287" w:type="dxa"/>
+            <w:tcW w:w="332" w:type="dxa"/>
             <w:vMerge/>
             <w:tcBorders>
               <w:top w:val="nil"/>
@@ -6854,7 +6849,7 @@
         </w:tc>
         <w:tc>
           <w:tcPr>
-            <w:tcW w:w="417" w:type="dxa"/>
+            <w:tcW w:w="485" w:type="dxa"/>
             <w:vMerge/>
             <w:tcBorders>
               <w:top w:val="nil"/>
@@ -6873,7 +6868,7 @@
         </w:tc>
         <w:tc>
           <w:tcPr>
-            <w:tcW w:w="415" w:type="dxa"/>
+            <w:tcW w:w="482" w:type="dxa"/>
             <w:vMerge/>
             <w:tcBorders>
               <w:top w:val="nil"/>
@@ -6892,7 +6887,7 @@
         </w:tc>
         <w:tc>
           <w:tcPr>
-            <w:tcW w:w="393" w:type="dxa"/>
+            <w:tcW w:w="470" w:type="dxa"/>
             <w:vMerge/>
             <w:tcBorders>
               <w:top w:val="nil"/>
@@ -6911,7 +6906,7 @@
         </w:tc>
         <w:tc>
           <w:tcPr>
-            <w:tcW w:w="393" w:type="dxa"/>
+            <w:tcW w:w="462" w:type="dxa"/>
             <w:vMerge/>
             <w:tcBorders>
               <w:top w:val="nil"/>
@@ -6930,7 +6925,7 @@
         </w:tc>
         <w:tc>
           <w:tcPr>
-            <w:tcW w:w="395" w:type="dxa"/>
+            <w:tcW w:w="458" w:type="dxa"/>
             <w:vMerge/>
             <w:tcBorders>
               <w:top w:val="nil"/>
@@ -6948,7 +6943,7 @@
         </w:tc>
         <w:tc>
           <w:tcPr>
-            <w:tcW w:w="393" w:type="dxa"/>
+            <w:tcW w:w="462" w:type="dxa"/>
             <w:vMerge/>
             <w:tcBorders>
               <w:top w:val="nil"/>
@@ -6966,7 +6961,7 @@
         </w:tc>
         <w:tc>
           <w:tcPr>
-            <w:tcW w:w="392" w:type="dxa"/>
+            <w:tcW w:w="455" w:type="dxa"/>
             <w:vMerge/>
             <w:tcBorders>
               <w:top w:val="nil"/>
@@ -6985,11 +6980,11 @@
       </w:tr>
       <w:tr>
         <w:trPr>
-          <w:trHeight w:hRule="exact" w:val="10"/>
+          <w:trHeight w:hRule="exact" w:val="5"/>
         </w:trPr>
         <w:tc>
           <w:tcPr>
-            <w:tcW w:w="3027" w:type="dxa"/>
+            <w:tcW w:w="3544" w:type="dxa"/>
             <w:vMerge w:val="restart"/>
           </w:tcPr>
           <w:p>
@@ -7032,8 +7027,59 @@
         </w:tc>
         <w:tc>
           <w:tcPr>
-            <w:tcW w:w="360" w:type="dxa"/>
+            <w:tcW w:w="417" w:type="dxa"/>
             <w:vMerge w:val="restart"/>
+          </w:tcPr>
+          <w:p>
+            <w:pPr>
+              <w:pStyle w:val="TableParagraph"/>
+              <w:jc w:val="both"/>
+              <w:rPr>
+                <w:sz w:val="24"/>
+              </w:rPr>
+            </w:pPr>
+          </w:p>
+        </w:tc>
+        <w:tc>
+          <w:tcPr>
+            <w:tcW w:w="415" w:type="dxa"/>
+            <w:vMerge w:val="restart"/>
+          </w:tcPr>
+          <w:p>
+            <w:pPr>
+              <w:pStyle w:val="TableParagraph"/>
+              <w:jc w:val="both"/>
+              <w:rPr>
+                <w:sz w:val="24"/>
+              </w:rPr>
+            </w:pPr>
+          </w:p>
+        </w:tc>
+        <w:tc>
+          <w:tcPr>
+            <w:tcW w:w="422" w:type="dxa"/>
+            <w:vMerge w:val="restart"/>
+            <w:tcBorders>
+              <w:right w:val="single" w:sz="2" w:space="0" w:color="000000"/>
+            </w:tcBorders>
+          </w:tcPr>
+          <w:p>
+            <w:pPr>
+              <w:pStyle w:val="TableParagraph"/>
+              <w:jc w:val="both"/>
+              <w:rPr>
+                <w:sz w:val="24"/>
+              </w:rPr>
+            </w:pPr>
+          </w:p>
+        </w:tc>
+        <w:tc>
+          <w:tcPr>
+            <w:tcW w:w="421" w:type="dxa"/>
+            <w:vMerge w:val="restart"/>
+            <w:tcBorders>
+              <w:left w:val="single" w:sz="2" w:space="0" w:color="000000"/>
+            </w:tcBorders>
           </w:tcPr>
           <w:p>
             <w:pPr>
@@ -7062,80 +7108,47 @@
         </w:tc>
         <w:tc>
           <w:tcPr>
-            <w:tcW w:w="358" w:type="dxa"/>
+            <w:tcW w:w="3333" w:type="dxa"/>
+            <w:gridSpan w:val="8"/>
+            <w:tcBorders>
+              <w:top w:val="nil"/>
+              <w:bottom w:val="nil"/>
+            </w:tcBorders>
+            <w:shd w:val="clear" w:color="auto" w:fill="000000"/>
+          </w:tcPr>
+          <w:p>
+            <w:pPr>
+              <w:pStyle w:val="TableParagraph"/>
+              <w:jc w:val="both"/>
+              <w:rPr>
+                <w:sz w:val="2"/>
+              </w:rPr>
+            </w:pPr>
+          </w:p>
+        </w:tc>
+        <w:tc>
+          <w:tcPr>
+            <w:tcW w:w="458" w:type="dxa"/>
             <w:vMerge w:val="restart"/>
             <w:tcBorders>
-              <w:right w:val="single" w:sz="2" w:space="0" w:color="000000"/>
-            </w:tcBorders>
-          </w:tcPr>
-          <w:p>
-            <w:pPr>
-              <w:pStyle w:val="TableParagraph"/>
-              <w:jc w:val="both"/>
-              <w:rPr>
-                <w:sz w:val="24"/>
-              </w:rPr>
-            </w:pPr>
-          </w:p>
-        </w:tc>
-        <w:tc>
-          <w:tcPr>
-            <w:tcW w:w="358" w:type="dxa"/>
+              <w:bottom w:val="single" w:sz="48" w:space="0" w:color="000000"/>
+            </w:tcBorders>
+          </w:tcPr>
+          <w:p>
+            <w:pPr>
+              <w:pStyle w:val="TableParagraph"/>
+              <w:jc w:val="both"/>
+              <w:rPr>
+                <w:sz w:val="24"/>
+              </w:rPr>
+            </w:pPr>
+          </w:p>
+        </w:tc>
+        <w:tc>
+          <w:tcPr>
+            <w:tcW w:w="462" w:type="dxa"/>
             <w:vMerge w:val="restart"/>
             <w:tcBorders>
-              <w:left w:val="single" w:sz="2" w:space="0" w:color="000000"/>
-            </w:tcBorders>
-          </w:tcPr>
-          <w:p>
-            <w:pPr>
-              <w:pStyle w:val="TableParagraph"/>
-              <w:jc w:val="both"/>
-              <w:rPr>
-                <w:sz w:val="24"/>
-              </w:rPr>
-            </w:pPr>
-          </w:p>
-        </w:tc>
-        <w:tc>
-          <w:tcPr>
-            <w:tcW w:w="310" w:type="dxa"/>
-            <w:vMerge w:val="restart"/>
-          </w:tcPr>
-          <w:p>
-            <w:pPr>
-              <w:pStyle w:val="TableParagraph"/>
-              <w:jc w:val="both"/>
-              <w:rPr>
-                <w:sz w:val="24"/>
-              </w:rPr>
-            </w:pPr>
-          </w:p>
-        </w:tc>
-        <w:tc>
-          <w:tcPr>
-            <w:tcW w:w="2844" w:type="dxa"/>
-            <w:gridSpan w:val="8"/>
-            <w:tcBorders>
-              <w:top w:val="nil"/>
-              <w:bottom w:val="nil"/>
-            </w:tcBorders>
-            <w:shd w:val="clear" w:color="auto" w:fill="000000"/>
-          </w:tcPr>
-          <w:p>
-            <w:pPr>
-              <w:pStyle w:val="TableParagraph"/>
-              <w:jc w:val="both"/>
-              <w:rPr>
-                <w:sz w:val="2"/>
-              </w:rPr>
-            </w:pPr>
-          </w:p>
-        </w:tc>
-        <w:tc>
-          <w:tcPr>
-            <w:tcW w:w="395" w:type="dxa"/>
-            <w:vMerge w:val="restart"/>
-            <w:tcBorders>
               <w:bottom w:val="single" w:sz="48" w:space="0" w:color="000000"/>
             </w:tcBorders>
           </w:tcPr>
@@ -7151,25 +7164,8 @@
         </w:tc>
         <w:tc>
           <w:tcPr>
-            <w:tcW w:w="393" w:type="dxa"/>
-            <w:vMerge w:val="restart"/>
-            <w:tcBorders>
-              <w:bottom w:val="single" w:sz="48" w:space="0" w:color="000000"/>
-            </w:tcBorders>
-          </w:tcPr>
-          <w:p>
-            <w:pPr>
-              <w:pStyle w:val="TableParagraph"/>
-              <w:jc w:val="both"/>
-              <w:rPr>
-                <w:sz w:val="24"/>
-              </w:rPr>
-            </w:pPr>
-          </w:p>
-        </w:tc>
-        <w:tc>
-          <w:tcPr>
-            <w:tcW w:w="392" w:type="dxa"/>
+            <w:tcW w:w="508" w:type="dxa"/>
+            <w:gridSpan w:val="2"/>
             <w:vMerge w:val="restart"/>
           </w:tcPr>
           <w:p>
@@ -7185,11 +7181,13 @@
       </w:tr>
       <w:tr>
         <w:trPr>
-          <w:trHeight w:val="1066"/>
+          <w:gridAfter w:val="1"/>
+          <w:wAfter w:w="59" w:type="dxa"/>
+          <w:trHeight w:val="1025"/>
         </w:trPr>
         <w:tc>
           <w:tcPr>
-            <w:tcW w:w="3027" w:type="dxa"/>
+            <w:tcW w:w="3544" w:type="dxa"/>
             <w:vMerge/>
             <w:tcBorders>
               <w:top w:val="nil"/>
@@ -7207,7 +7205,7 @@
         </w:tc>
         <w:tc>
           <w:tcPr>
-            <w:tcW w:w="360" w:type="dxa"/>
+            <w:tcW w:w="417" w:type="dxa"/>
             <w:vMerge/>
             <w:tcBorders>
               <w:top w:val="nil"/>
@@ -7225,6 +7223,62 @@
         </w:tc>
         <w:tc>
           <w:tcPr>
+            <w:tcW w:w="415" w:type="dxa"/>
+            <w:vMerge/>
+            <w:tcBorders>
+              <w:top w:val="nil"/>
+            </w:tcBorders>
+          </w:tcPr>
+          <w:p>
+            <w:pPr>
+              <w:jc w:val="both"/>
+              <w:rPr>
+                <w:sz w:val="2"/>
+                <w:szCs w:val="2"/>
+              </w:rPr>
+            </w:pPr>
+          </w:p>
+        </w:tc>
+        <w:tc>
+          <w:tcPr>
+            <w:tcW w:w="422" w:type="dxa"/>
+            <w:vMerge/>
+            <w:tcBorders>
+              <w:top w:val="nil"/>
+              <w:right w:val="single" w:sz="2" w:space="0" w:color="000000"/>
+            </w:tcBorders>
+          </w:tcPr>
+          <w:p>
+            <w:pPr>
+              <w:jc w:val="both"/>
+              <w:rPr>
+                <w:sz w:val="2"/>
+                <w:szCs w:val="2"/>
+              </w:rPr>
+            </w:pPr>
+          </w:p>
+        </w:tc>
+        <w:tc>
+          <w:tcPr>
+            <w:tcW w:w="421" w:type="dxa"/>
+            <w:vMerge/>
+            <w:tcBorders>
+              <w:top w:val="nil"/>
+              <w:left w:val="single" w:sz="2" w:space="0" w:color="000000"/>
+            </w:tcBorders>
+          </w:tcPr>
+          <w:p>
+            <w:pPr>
+              <w:jc w:val="both"/>
+              <w:rPr>
+                <w:sz w:val="2"/>
+                <w:szCs w:val="2"/>
+              </w:rPr>
+            </w:pPr>
+          </w:p>
+        </w:tc>
+        <w:tc>
+          <w:tcPr>
             <w:tcW w:w="358" w:type="dxa"/>
             <w:vMerge/>
             <w:tcBorders>
@@ -7243,11 +7297,158 @@
         </w:tc>
         <w:tc>
           <w:tcPr>
-            <w:tcW w:w="358" w:type="dxa"/>
+            <w:tcW w:w="368" w:type="dxa"/>
+            <w:tcBorders>
+              <w:top w:val="nil"/>
+            </w:tcBorders>
+            <w:shd w:val="clear" w:color="auto" w:fill="F0C231"/>
+          </w:tcPr>
+          <w:p>
+            <w:pPr>
+              <w:pStyle w:val="TableParagraph"/>
+              <w:jc w:val="both"/>
+              <w:rPr>
+                <w:sz w:val="24"/>
+              </w:rPr>
+            </w:pPr>
+          </w:p>
+        </w:tc>
+        <w:tc>
+          <w:tcPr>
+            <w:tcW w:w="362" w:type="dxa"/>
+            <w:tcBorders>
+              <w:top w:val="nil"/>
+              <w:right w:val="single" w:sz="2" w:space="0" w:color="000000"/>
+            </w:tcBorders>
+            <w:shd w:val="clear" w:color="auto" w:fill="F0C231"/>
+          </w:tcPr>
+          <w:p>
+            <w:pPr>
+              <w:pStyle w:val="TableParagraph"/>
+              <w:jc w:val="both"/>
+              <w:rPr>
+                <w:sz w:val="24"/>
+              </w:rPr>
+            </w:pPr>
+          </w:p>
+        </w:tc>
+        <w:tc>
+          <w:tcPr>
+            <w:tcW w:w="369" w:type="dxa"/>
+            <w:tcBorders>
+              <w:top w:val="nil"/>
+              <w:left w:val="single" w:sz="2" w:space="0" w:color="000000"/>
+            </w:tcBorders>
+            <w:shd w:val="clear" w:color="auto" w:fill="F0C231"/>
+          </w:tcPr>
+          <w:p>
+            <w:pPr>
+              <w:pStyle w:val="TableParagraph"/>
+              <w:jc w:val="both"/>
+              <w:rPr>
+                <w:sz w:val="24"/>
+              </w:rPr>
+            </w:pPr>
+          </w:p>
+        </w:tc>
+        <w:tc>
+          <w:tcPr>
+            <w:tcW w:w="332" w:type="dxa"/>
+            <w:tcBorders>
+              <w:top w:val="nil"/>
+            </w:tcBorders>
+            <w:shd w:val="clear" w:color="auto" w:fill="F0C231"/>
+          </w:tcPr>
+          <w:p>
+            <w:pPr>
+              <w:pStyle w:val="TableParagraph"/>
+              <w:jc w:val="both"/>
+              <w:rPr>
+                <w:sz w:val="24"/>
+              </w:rPr>
+            </w:pPr>
+          </w:p>
+        </w:tc>
+        <w:tc>
+          <w:tcPr>
+            <w:tcW w:w="485" w:type="dxa"/>
+            <w:tcBorders>
+              <w:top w:val="nil"/>
+            </w:tcBorders>
+            <w:shd w:val="clear" w:color="auto" w:fill="F0C231"/>
+          </w:tcPr>
+          <w:p>
+            <w:pPr>
+              <w:pStyle w:val="TableParagraph"/>
+              <w:jc w:val="both"/>
+              <w:rPr>
+                <w:sz w:val="24"/>
+              </w:rPr>
+            </w:pPr>
+          </w:p>
+        </w:tc>
+        <w:tc>
+          <w:tcPr>
+            <w:tcW w:w="482" w:type="dxa"/>
+            <w:tcBorders>
+              <w:top w:val="nil"/>
+            </w:tcBorders>
+            <w:shd w:val="clear" w:color="auto" w:fill="F0C231"/>
+          </w:tcPr>
+          <w:p>
+            <w:pPr>
+              <w:pStyle w:val="TableParagraph"/>
+              <w:jc w:val="both"/>
+              <w:rPr>
+                <w:sz w:val="24"/>
+              </w:rPr>
+            </w:pPr>
+          </w:p>
+        </w:tc>
+        <w:tc>
+          <w:tcPr>
+            <w:tcW w:w="470" w:type="dxa"/>
+            <w:tcBorders>
+              <w:top w:val="nil"/>
+            </w:tcBorders>
+            <w:shd w:val="clear" w:color="auto" w:fill="F0C231"/>
+          </w:tcPr>
+          <w:p>
+            <w:pPr>
+              <w:pStyle w:val="TableParagraph"/>
+              <w:jc w:val="both"/>
+              <w:rPr>
+                <w:sz w:val="24"/>
+              </w:rPr>
+            </w:pPr>
+          </w:p>
+        </w:tc>
+        <w:tc>
+          <w:tcPr>
+            <w:tcW w:w="462" w:type="dxa"/>
+            <w:tcBorders>
+              <w:top w:val="nil"/>
+              <w:bottom w:val="nil"/>
+            </w:tcBorders>
+            <w:shd w:val="clear" w:color="auto" w:fill="F0C231"/>
+          </w:tcPr>
+          <w:p>
+            <w:pPr>
+              <w:pStyle w:val="TableParagraph"/>
+              <w:jc w:val="both"/>
+              <w:rPr>
+                <w:sz w:val="24"/>
+              </w:rPr>
+            </w:pPr>
+          </w:p>
+        </w:tc>
+        <w:tc>
+          <w:tcPr>
+            <w:tcW w:w="458" w:type="dxa"/>
             <w:vMerge/>
             <w:tcBorders>
               <w:top w:val="nil"/>
-              <w:right w:val="single" w:sz="2" w:space="0" w:color="000000"/>
+              <w:bottom w:val="single" w:sz="48" w:space="0" w:color="000000"/>
             </w:tcBorders>
           </w:tcPr>
           <w:p>
@@ -7262,11 +7463,11 @@
         </w:tc>
         <w:tc>
           <w:tcPr>
-            <w:tcW w:w="358" w:type="dxa"/>
+            <w:tcW w:w="462" w:type="dxa"/>
             <w:vMerge/>
             <w:tcBorders>
               <w:top w:val="nil"/>
-              <w:left w:val="single" w:sz="2" w:space="0" w:color="000000"/>
+              <w:bottom w:val="single" w:sz="48" w:space="0" w:color="000000"/>
             </w:tcBorders>
           </w:tcPr>
           <w:p>
@@ -7281,210 +7482,7 @@
         </w:tc>
         <w:tc>
           <w:tcPr>
-            <w:tcW w:w="310" w:type="dxa"/>
-            <w:vMerge/>
-            <w:tcBorders>
-              <w:top w:val="nil"/>
-            </w:tcBorders>
-          </w:tcPr>
-          <w:p>
-            <w:pPr>
-              <w:jc w:val="both"/>
-              <w:rPr>
-                <w:sz w:val="2"/>
-                <w:szCs w:val="2"/>
-              </w:rPr>
-            </w:pPr>
-          </w:p>
-        </w:tc>
-        <w:tc>
-          <w:tcPr>
-            <w:tcW w:w="315" w:type="dxa"/>
-            <w:tcBorders>
-              <w:top w:val="nil"/>
-            </w:tcBorders>
-            <w:shd w:val="clear" w:color="auto" w:fill="F0C231"/>
-          </w:tcPr>
-          <w:p>
-            <w:pPr>
-              <w:pStyle w:val="TableParagraph"/>
-              <w:jc w:val="both"/>
-              <w:rPr>
-                <w:sz w:val="24"/>
-              </w:rPr>
-            </w:pPr>
-          </w:p>
-        </w:tc>
-        <w:tc>
-          <w:tcPr>
-            <w:tcW w:w="313" w:type="dxa"/>
-            <w:tcBorders>
-              <w:top w:val="nil"/>
-              <w:right w:val="single" w:sz="2" w:space="0" w:color="000000"/>
-            </w:tcBorders>
-            <w:shd w:val="clear" w:color="auto" w:fill="F0C231"/>
-          </w:tcPr>
-          <w:p>
-            <w:pPr>
-              <w:pStyle w:val="TableParagraph"/>
-              <w:jc w:val="both"/>
-              <w:rPr>
-                <w:sz w:val="24"/>
-              </w:rPr>
-            </w:pPr>
-          </w:p>
-        </w:tc>
-        <w:tc>
-          <w:tcPr>
-            <w:tcW w:w="311" w:type="dxa"/>
-            <w:tcBorders>
-              <w:top w:val="nil"/>
-              <w:left w:val="single" w:sz="2" w:space="0" w:color="000000"/>
-            </w:tcBorders>
-            <w:shd w:val="clear" w:color="auto" w:fill="F0C231"/>
-          </w:tcPr>
-          <w:p>
-            <w:pPr>
-              <w:pStyle w:val="TableParagraph"/>
-              <w:jc w:val="both"/>
-              <w:rPr>
-                <w:sz w:val="24"/>
-              </w:rPr>
-            </w:pPr>
-          </w:p>
-        </w:tc>
-        <w:tc>
-          <w:tcPr>
-            <w:tcW w:w="287" w:type="dxa"/>
-            <w:tcBorders>
-              <w:top w:val="nil"/>
-            </w:tcBorders>
-            <w:shd w:val="clear" w:color="auto" w:fill="F0C231"/>
-          </w:tcPr>
-          <w:p>
-            <w:pPr>
-              <w:pStyle w:val="TableParagraph"/>
-              <w:jc w:val="both"/>
-              <w:rPr>
-                <w:sz w:val="24"/>
-              </w:rPr>
-            </w:pPr>
-          </w:p>
-        </w:tc>
-        <w:tc>
-          <w:tcPr>
-            <w:tcW w:w="417" w:type="dxa"/>
-            <w:tcBorders>
-              <w:top w:val="nil"/>
-            </w:tcBorders>
-            <w:shd w:val="clear" w:color="auto" w:fill="F0C231"/>
-          </w:tcPr>
-          <w:p>
-            <w:pPr>
-              <w:pStyle w:val="TableParagraph"/>
-              <w:jc w:val="both"/>
-              <w:rPr>
-                <w:sz w:val="24"/>
-              </w:rPr>
-            </w:pPr>
-          </w:p>
-        </w:tc>
-        <w:tc>
-          <w:tcPr>
-            <w:tcW w:w="415" w:type="dxa"/>
-            <w:tcBorders>
-              <w:top w:val="nil"/>
-            </w:tcBorders>
-            <w:shd w:val="clear" w:color="auto" w:fill="F0C231"/>
-          </w:tcPr>
-          <w:p>
-            <w:pPr>
-              <w:pStyle w:val="TableParagraph"/>
-              <w:jc w:val="both"/>
-              <w:rPr>
-                <w:sz w:val="24"/>
-              </w:rPr>
-            </w:pPr>
-          </w:p>
-        </w:tc>
-        <w:tc>
-          <w:tcPr>
-            <w:tcW w:w="393" w:type="dxa"/>
-            <w:tcBorders>
-              <w:top w:val="nil"/>
-            </w:tcBorders>
-            <w:shd w:val="clear" w:color="auto" w:fill="F0C231"/>
-          </w:tcPr>
-          <w:p>
-            <w:pPr>
-              <w:pStyle w:val="TableParagraph"/>
-              <w:jc w:val="both"/>
-              <w:rPr>
-                <w:sz w:val="24"/>
-              </w:rPr>
-            </w:pPr>
-          </w:p>
-        </w:tc>
-        <w:tc>
-          <w:tcPr>
-            <w:tcW w:w="393" w:type="dxa"/>
-            <w:tcBorders>
-              <w:top w:val="nil"/>
-              <w:bottom w:val="nil"/>
-            </w:tcBorders>
-            <w:shd w:val="clear" w:color="auto" w:fill="F0C231"/>
-          </w:tcPr>
-          <w:p>
-            <w:pPr>
-              <w:pStyle w:val="TableParagraph"/>
-              <w:jc w:val="both"/>
-              <w:rPr>
-                <w:sz w:val="24"/>
-              </w:rPr>
-            </w:pPr>
-          </w:p>
-        </w:tc>
-        <w:tc>
-          <w:tcPr>
-            <w:tcW w:w="395" w:type="dxa"/>
-            <w:vMerge/>
-            <w:tcBorders>
-              <w:top w:val="nil"/>
-              <w:bottom w:val="single" w:sz="48" w:space="0" w:color="000000"/>
-            </w:tcBorders>
-          </w:tcPr>
-          <w:p>
-            <w:pPr>
-              <w:jc w:val="both"/>
-              <w:rPr>
-                <w:sz w:val="2"/>
-                <w:szCs w:val="2"/>
-              </w:rPr>
-            </w:pPr>
-          </w:p>
-        </w:tc>
-        <w:tc>
-          <w:tcPr>
-            <w:tcW w:w="393" w:type="dxa"/>
-            <w:vMerge/>
-            <w:tcBorders>
-              <w:top w:val="nil"/>
-              <w:bottom w:val="single" w:sz="48" w:space="0" w:color="000000"/>
-            </w:tcBorders>
-          </w:tcPr>
-          <w:p>
-            <w:pPr>
-              <w:jc w:val="both"/>
-              <w:rPr>
-                <w:sz w:val="2"/>
-                <w:szCs w:val="2"/>
-              </w:rPr>
-            </w:pPr>
-          </w:p>
-        </w:tc>
-        <w:tc>
-          <w:tcPr>
-            <w:tcW w:w="392" w:type="dxa"/>
+            <w:tcW w:w="455" w:type="dxa"/>
             <w:vMerge/>
             <w:tcBorders>
               <w:top w:val="nil"/>
@@ -7503,11 +7501,13 @@
       </w:tr>
       <w:tr>
         <w:trPr>
-          <w:trHeight w:val="33"/>
+          <w:gridAfter w:val="1"/>
+          <w:wAfter w:w="59" w:type="dxa"/>
+          <w:trHeight w:val="27"/>
         </w:trPr>
         <w:tc>
           <w:tcPr>
-            <w:tcW w:w="3027" w:type="dxa"/>
+            <w:tcW w:w="3544" w:type="dxa"/>
             <w:vMerge w:val="restart"/>
           </w:tcPr>
           <w:p>
@@ -7570,8 +7570,59 @@
         </w:tc>
         <w:tc>
           <w:tcPr>
-            <w:tcW w:w="360" w:type="dxa"/>
+            <w:tcW w:w="417" w:type="dxa"/>
             <w:vMerge w:val="restart"/>
+          </w:tcPr>
+          <w:p>
+            <w:pPr>
+              <w:pStyle w:val="TableParagraph"/>
+              <w:jc w:val="both"/>
+              <w:rPr>
+                <w:sz w:val="24"/>
+              </w:rPr>
+            </w:pPr>
+          </w:p>
+        </w:tc>
+        <w:tc>
+          <w:tcPr>
+            <w:tcW w:w="415" w:type="dxa"/>
+            <w:vMerge w:val="restart"/>
+          </w:tcPr>
+          <w:p>
+            <w:pPr>
+              <w:pStyle w:val="TableParagraph"/>
+              <w:jc w:val="both"/>
+              <w:rPr>
+                <w:sz w:val="24"/>
+              </w:rPr>
+            </w:pPr>
+          </w:p>
+        </w:tc>
+        <w:tc>
+          <w:tcPr>
+            <w:tcW w:w="422" w:type="dxa"/>
+            <w:vMerge w:val="restart"/>
+            <w:tcBorders>
+              <w:right w:val="single" w:sz="2" w:space="0" w:color="000000"/>
+            </w:tcBorders>
+          </w:tcPr>
+          <w:p>
+            <w:pPr>
+              <w:pStyle w:val="TableParagraph"/>
+              <w:jc w:val="both"/>
+              <w:rPr>
+                <w:sz w:val="24"/>
+              </w:rPr>
+            </w:pPr>
+          </w:p>
+        </w:tc>
+        <w:tc>
+          <w:tcPr>
+            <w:tcW w:w="421" w:type="dxa"/>
+            <w:vMerge w:val="restart"/>
+            <w:tcBorders>
+              <w:left w:val="single" w:sz="2" w:space="0" w:color="000000"/>
+            </w:tcBorders>
           </w:tcPr>
           <w:p>
             <w:pPr>
@@ -7600,8 +7651,23 @@
         </w:tc>
         <w:tc>
           <w:tcPr>
-            <w:tcW w:w="358" w:type="dxa"/>
+            <w:tcW w:w="368" w:type="dxa"/>
             <w:vMerge w:val="restart"/>
+          </w:tcPr>
+          <w:p>
+            <w:pPr>
+              <w:pStyle w:val="TableParagraph"/>
+              <w:jc w:val="both"/>
+              <w:rPr>
+                <w:sz w:val="24"/>
+              </w:rPr>
+            </w:pPr>
+          </w:p>
+        </w:tc>
+        <w:tc>
+          <w:tcPr>
+            <w:tcW w:w="362" w:type="dxa"/>
+            <w:vMerge w:val="restart"/>
             <w:tcBorders>
               <w:right w:val="single" w:sz="2" w:space="0" w:color="000000"/>
             </w:tcBorders>
@@ -7618,7 +7684,7 @@
         </w:tc>
         <w:tc>
           <w:tcPr>
-            <w:tcW w:w="358" w:type="dxa"/>
+            <w:tcW w:w="369" w:type="dxa"/>
             <w:vMerge w:val="restart"/>
             <w:tcBorders>
               <w:left w:val="single" w:sz="2" w:space="0" w:color="000000"/>
@@ -7636,7 +7702,7 @@
         </w:tc>
         <w:tc>
           <w:tcPr>
-            <w:tcW w:w="310" w:type="dxa"/>
+            <w:tcW w:w="332" w:type="dxa"/>
             <w:vMerge w:val="restart"/>
           </w:tcPr>
           <w:p>
@@ -7651,7 +7717,7 @@
         </w:tc>
         <w:tc>
           <w:tcPr>
-            <w:tcW w:w="315" w:type="dxa"/>
+            <w:tcW w:w="485" w:type="dxa"/>
             <w:vMerge w:val="restart"/>
           </w:tcPr>
           <w:p>
@@ -7666,103 +7732,37 @@
         </w:tc>
         <w:tc>
           <w:tcPr>
-            <w:tcW w:w="313" w:type="dxa"/>
+            <w:tcW w:w="482" w:type="dxa"/>
             <w:vMerge w:val="restart"/>
-            <w:tcBorders>
-              <w:right w:val="single" w:sz="2" w:space="0" w:color="000000"/>
-            </w:tcBorders>
-          </w:tcPr>
-          <w:p>
-            <w:pPr>
-              <w:pStyle w:val="TableParagraph"/>
-              <w:jc w:val="both"/>
-              <w:rPr>
-                <w:sz w:val="24"/>
-              </w:rPr>
-            </w:pPr>
-          </w:p>
-        </w:tc>
-        <w:tc>
-          <w:tcPr>
-            <w:tcW w:w="311" w:type="dxa"/>
+          </w:tcPr>
+          <w:p>
+            <w:pPr>
+              <w:pStyle w:val="TableParagraph"/>
+              <w:jc w:val="both"/>
+              <w:rPr>
+                <w:sz w:val="24"/>
+              </w:rPr>
+            </w:pPr>
+          </w:p>
+        </w:tc>
+        <w:tc>
+          <w:tcPr>
+            <w:tcW w:w="470" w:type="dxa"/>
             <w:vMerge w:val="restart"/>
-            <w:tcBorders>
-              <w:left w:val="single" w:sz="2" w:space="0" w:color="000000"/>
-            </w:tcBorders>
-          </w:tcPr>
-          <w:p>
-            <w:pPr>
-              <w:pStyle w:val="TableParagraph"/>
-              <w:jc w:val="both"/>
-              <w:rPr>
-                <w:sz w:val="24"/>
-              </w:rPr>
-            </w:pPr>
-          </w:p>
-        </w:tc>
-        <w:tc>
-          <w:tcPr>
-            <w:tcW w:w="287" w:type="dxa"/>
-            <w:vMerge w:val="restart"/>
-          </w:tcPr>
-          <w:p>
-            <w:pPr>
-              <w:pStyle w:val="TableParagraph"/>
-              <w:jc w:val="both"/>
-              <w:rPr>
-                <w:sz w:val="24"/>
-              </w:rPr>
-            </w:pPr>
-          </w:p>
-        </w:tc>
-        <w:tc>
-          <w:tcPr>
-            <w:tcW w:w="417" w:type="dxa"/>
-            <w:vMerge w:val="restart"/>
-          </w:tcPr>
-          <w:p>
-            <w:pPr>
-              <w:pStyle w:val="TableParagraph"/>
-              <w:jc w:val="both"/>
-              <w:rPr>
-                <w:sz w:val="24"/>
-              </w:rPr>
-            </w:pPr>
-          </w:p>
-        </w:tc>
-        <w:tc>
-          <w:tcPr>
-            <w:tcW w:w="415" w:type="dxa"/>
-            <w:vMerge w:val="restart"/>
-          </w:tcPr>
-          <w:p>
-            <w:pPr>
-              <w:pStyle w:val="TableParagraph"/>
-              <w:jc w:val="both"/>
-              <w:rPr>
-                <w:sz w:val="24"/>
-              </w:rPr>
-            </w:pPr>
-          </w:p>
-        </w:tc>
-        <w:tc>
-          <w:tcPr>
-            <w:tcW w:w="393" w:type="dxa"/>
-            <w:vMerge w:val="restart"/>
-          </w:tcPr>
-          <w:p>
-            <w:pPr>
-              <w:pStyle w:val="TableParagraph"/>
-              <w:jc w:val="both"/>
-              <w:rPr>
-                <w:sz w:val="24"/>
-              </w:rPr>
-            </w:pPr>
-          </w:p>
-        </w:tc>
-        <w:tc>
-          <w:tcPr>
-            <w:tcW w:w="393" w:type="dxa"/>
+          </w:tcPr>
+          <w:p>
+            <w:pPr>
+              <w:pStyle w:val="TableParagraph"/>
+              <w:jc w:val="both"/>
+              <w:rPr>
+                <w:sz w:val="24"/>
+              </w:rPr>
+            </w:pPr>
+          </w:p>
+        </w:tc>
+        <w:tc>
+          <w:tcPr>
+            <w:tcW w:w="462" w:type="dxa"/>
             <w:tcBorders>
               <w:top w:val="nil"/>
               <w:bottom w:val="nil"/>
@@ -7781,7 +7781,7 @@
         </w:tc>
         <w:tc>
           <w:tcPr>
-            <w:tcW w:w="395" w:type="dxa"/>
+            <w:tcW w:w="458" w:type="dxa"/>
             <w:tcBorders>
               <w:top w:val="single" w:sz="48" w:space="0" w:color="000000"/>
               <w:bottom w:val="nil"/>
@@ -7800,7 +7800,7 @@
         </w:tc>
         <w:tc>
           <w:tcPr>
-            <w:tcW w:w="393" w:type="dxa"/>
+            <w:tcW w:w="462" w:type="dxa"/>
             <w:tcBorders>
               <w:top w:val="single" w:sz="48" w:space="0" w:color="000000"/>
               <w:bottom w:val="nil"/>
@@ -7819,7 +7819,7 @@
         </w:tc>
         <w:tc>
           <w:tcPr>
-            <w:tcW w:w="392" w:type="dxa"/>
+            <w:tcW w:w="455" w:type="dxa"/>
             <w:vMerge w:val="restart"/>
           </w:tcPr>
           <w:p>
@@ -7835,11 +7835,13 @@
       </w:tr>
       <w:tr>
         <w:trPr>
-          <w:trHeight w:val="1310"/>
+          <w:gridAfter w:val="1"/>
+          <w:wAfter w:w="59" w:type="dxa"/>
+          <w:trHeight w:val="1262"/>
         </w:trPr>
         <w:tc>
           <w:tcPr>
-            <w:tcW w:w="3027" w:type="dxa"/>
+            <w:tcW w:w="3544" w:type="dxa"/>
             <w:vMerge/>
             <w:tcBorders>
               <w:top w:val="nil"/>
@@ -7857,7 +7859,7 @@
         </w:tc>
         <w:tc>
           <w:tcPr>
-            <w:tcW w:w="360" w:type="dxa"/>
+            <w:tcW w:w="417" w:type="dxa"/>
             <w:vMerge/>
             <w:tcBorders>
               <w:top w:val="nil"/>
@@ -7875,6 +7877,62 @@
         </w:tc>
         <w:tc>
           <w:tcPr>
+            <w:tcW w:w="415" w:type="dxa"/>
+            <w:vMerge/>
+            <w:tcBorders>
+              <w:top w:val="nil"/>
+            </w:tcBorders>
+          </w:tcPr>
+          <w:p>
+            <w:pPr>
+              <w:jc w:val="both"/>
+              <w:rPr>
+                <w:sz w:val="2"/>
+                <w:szCs w:val="2"/>
+              </w:rPr>
+            </w:pPr>
+          </w:p>
+        </w:tc>
+        <w:tc>
+          <w:tcPr>
+            <w:tcW w:w="422" w:type="dxa"/>
+            <w:vMerge/>
+            <w:tcBorders>
+              <w:top w:val="nil"/>
+              <w:right w:val="single" w:sz="2" w:space="0" w:color="000000"/>
+            </w:tcBorders>
+          </w:tcPr>
+          <w:p>
+            <w:pPr>
+              <w:jc w:val="both"/>
+              <w:rPr>
+                <w:sz w:val="2"/>
+                <w:szCs w:val="2"/>
+              </w:rPr>
+            </w:pPr>
+          </w:p>
+        </w:tc>
+        <w:tc>
+          <w:tcPr>
+            <w:tcW w:w="421" w:type="dxa"/>
+            <w:vMerge/>
+            <w:tcBorders>
+              <w:top w:val="nil"/>
+              <w:left w:val="single" w:sz="2" w:space="0" w:color="000000"/>
+            </w:tcBorders>
+          </w:tcPr>
+          <w:p>
+            <w:pPr>
+              <w:jc w:val="both"/>
+              <w:rPr>
+                <w:sz w:val="2"/>
+                <w:szCs w:val="2"/>
+              </w:rPr>
+            </w:pPr>
+          </w:p>
+        </w:tc>
+        <w:tc>
+          <w:tcPr>
             <w:tcW w:w="358" w:type="dxa"/>
             <w:vMerge/>
             <w:tcBorders>
@@ -7893,11 +7951,10 @@
         </w:tc>
         <w:tc>
           <w:tcPr>
-            <w:tcW w:w="358" w:type="dxa"/>
+            <w:tcW w:w="368" w:type="dxa"/>
             <w:vMerge/>
             <w:tcBorders>
               <w:top w:val="nil"/>
-              <w:right w:val="single" w:sz="2" w:space="0" w:color="000000"/>
             </w:tcBorders>
           </w:tcPr>
           <w:p>
@@ -7912,11 +7969,11 @@
         </w:tc>
         <w:tc>
           <w:tcPr>
-            <w:tcW w:w="358" w:type="dxa"/>
+            <w:tcW w:w="362" w:type="dxa"/>
             <w:vMerge/>
             <w:tcBorders>
               <w:top w:val="nil"/>
-              <w:left w:val="single" w:sz="2" w:space="0" w:color="000000"/>
+              <w:right w:val="single" w:sz="2" w:space="0" w:color="000000"/>
             </w:tcBorders>
           </w:tcPr>
           <w:p>
@@ -7931,10 +7988,11 @@
         </w:tc>
         <w:tc>
           <w:tcPr>
-            <w:tcW w:w="310" w:type="dxa"/>
+            <w:tcW w:w="369" w:type="dxa"/>
             <w:vMerge/>
             <w:tcBorders>
               <w:top w:val="nil"/>
+              <w:left w:val="single" w:sz="2" w:space="0" w:color="000000"/>
             </w:tcBorders>
           </w:tcPr>
           <w:p>
@@ -7949,7 +8007,7 @@
         </w:tc>
         <w:tc>
           <w:tcPr>
-            <w:tcW w:w="315" w:type="dxa"/>
+            <w:tcW w:w="332" w:type="dxa"/>
             <w:vMerge/>
             <w:tcBorders>
               <w:top w:val="nil"/>
@@ -7967,11 +8025,10 @@
         </w:tc>
         <w:tc>
           <w:tcPr>
-            <w:tcW w:w="313" w:type="dxa"/>
+            <w:tcW w:w="485" w:type="dxa"/>
             <w:vMerge/>
             <w:tcBorders>
               <w:top w:val="nil"/>
-              <w:right w:val="single" w:sz="2" w:space="0" w:color="000000"/>
             </w:tcBorders>
           </w:tcPr>
           <w:p>
@@ -7986,11 +8043,10 @@
         </w:tc>
         <w:tc>
           <w:tcPr>
-            <w:tcW w:w="311" w:type="dxa"/>
+            <w:tcW w:w="482" w:type="dxa"/>
             <w:vMerge/>
             <w:tcBorders>
               <w:top w:val="nil"/>
-              <w:left w:val="single" w:sz="2" w:space="0" w:color="000000"/>
             </w:tcBorders>
           </w:tcPr>
           <w:p>
@@ -8005,7 +8061,7 @@
         </w:tc>
         <w:tc>
           <w:tcPr>
-            <w:tcW w:w="287" w:type="dxa"/>
+            <w:tcW w:w="470" w:type="dxa"/>
             <w:vMerge/>
             <w:tcBorders>
               <w:top w:val="nil"/>
@@ -8023,61 +8079,7 @@
         </w:tc>
         <w:tc>
           <w:tcPr>
-            <w:tcW w:w="417" w:type="dxa"/>
-            <w:vMerge/>
-            <w:tcBorders>
-              <w:top w:val="nil"/>
-            </w:tcBorders>
-          </w:tcPr>
-          <w:p>
-            <w:pPr>
-              <w:jc w:val="both"/>
-              <w:rPr>
-                <w:sz w:val="2"/>
-                <w:szCs w:val="2"/>
-              </w:rPr>
-            </w:pPr>
-          </w:p>
-        </w:tc>
-        <w:tc>
-          <w:tcPr>
-            <w:tcW w:w="415" w:type="dxa"/>
-            <w:vMerge/>
-            <w:tcBorders>
-              <w:top w:val="nil"/>
-            </w:tcBorders>
-          </w:tcPr>
-          <w:p>
-            <w:pPr>
-              <w:jc w:val="both"/>
-              <w:rPr>
-                <w:sz w:val="2"/>
-                <w:szCs w:val="2"/>
-              </w:rPr>
-            </w:pPr>
-          </w:p>
-        </w:tc>
-        <w:tc>
-          <w:tcPr>
-            <w:tcW w:w="393" w:type="dxa"/>
-            <w:vMerge/>
-            <w:tcBorders>
-              <w:top w:val="nil"/>
-            </w:tcBorders>
-          </w:tcPr>
-          <w:p>
-            <w:pPr>
-              <w:jc w:val="both"/>
-              <w:rPr>
-                <w:sz w:val="2"/>
-                <w:szCs w:val="2"/>
-              </w:rPr>
-            </w:pPr>
-          </w:p>
-        </w:tc>
-        <w:tc>
-          <w:tcPr>
-            <w:tcW w:w="393" w:type="dxa"/>
+            <w:tcW w:w="462" w:type="dxa"/>
             <w:tcBorders>
               <w:top w:val="nil"/>
             </w:tcBorders>
@@ -8095,7 +8097,7 @@
         </w:tc>
         <w:tc>
           <w:tcPr>
-            <w:tcW w:w="395" w:type="dxa"/>
+            <w:tcW w:w="458" w:type="dxa"/>
             <w:tcBorders>
               <w:top w:val="nil"/>
               <w:bottom w:val="nil"/>
@@ -8114,7 +8116,7 @@
         </w:tc>
         <w:tc>
           <w:tcPr>
-            <w:tcW w:w="393" w:type="dxa"/>
+            <w:tcW w:w="462" w:type="dxa"/>
             <w:tcBorders>
               <w:top w:val="nil"/>
               <w:bottom w:val="nil"/>
@@ -8133,7 +8135,7 @@
         </w:tc>
         <w:tc>
           <w:tcPr>
-            <w:tcW w:w="392" w:type="dxa"/>
+            <w:tcW w:w="455" w:type="dxa"/>
             <w:vMerge/>
             <w:tcBorders>
               <w:top w:val="nil"/>
@@ -8152,11 +8154,13 @@
       </w:tr>
       <w:tr>
         <w:trPr>
-          <w:trHeight w:val="31"/>
+          <w:gridAfter w:val="1"/>
+          <w:wAfter w:w="59" w:type="dxa"/>
+          <w:trHeight w:val="26"/>
         </w:trPr>
         <w:tc>
           <w:tcPr>
-            <w:tcW w:w="3027" w:type="dxa"/>
+            <w:tcW w:w="3544" w:type="dxa"/>
             <w:vMerge w:val="restart"/>
             <w:tcBorders>
               <w:bottom w:val="single" w:sz="2" w:space="0" w:color="000000"/>
@@ -8222,9 +8226,65 @@
         </w:tc>
         <w:tc>
           <w:tcPr>
-            <w:tcW w:w="360" w:type="dxa"/>
+            <w:tcW w:w="417" w:type="dxa"/>
             <w:vMerge w:val="restart"/>
             <w:tcBorders>
+              <w:bottom w:val="single" w:sz="2" w:space="0" w:color="000000"/>
+            </w:tcBorders>
+          </w:tcPr>
+          <w:p>
+            <w:pPr>
+              <w:pStyle w:val="TableParagraph"/>
+              <w:jc w:val="both"/>
+              <w:rPr>
+                <w:sz w:val="24"/>
+              </w:rPr>
+            </w:pPr>
+          </w:p>
+        </w:tc>
+        <w:tc>
+          <w:tcPr>
+            <w:tcW w:w="415" w:type="dxa"/>
+            <w:vMerge w:val="restart"/>
+            <w:tcBorders>
+              <w:bottom w:val="single" w:sz="2" w:space="0" w:color="000000"/>
+            </w:tcBorders>
+          </w:tcPr>
+          <w:p>
+            <w:pPr>
+              <w:pStyle w:val="TableParagraph"/>
+              <w:jc w:val="both"/>
+              <w:rPr>
+                <w:sz w:val="24"/>
+              </w:rPr>
+            </w:pPr>
+          </w:p>
+        </w:tc>
+        <w:tc>
+          <w:tcPr>
+            <w:tcW w:w="422" w:type="dxa"/>
+            <w:vMerge w:val="restart"/>
+            <w:tcBorders>
+              <w:bottom w:val="single" w:sz="2" w:space="0" w:color="000000"/>
+              <w:right w:val="single" w:sz="2" w:space="0" w:color="000000"/>
+            </w:tcBorders>
+          </w:tcPr>
+          <w:p>
+            <w:pPr>
+              <w:pStyle w:val="TableParagraph"/>
+              <w:jc w:val="both"/>
+              <w:rPr>
+                <w:sz w:val="24"/>
+              </w:rPr>
+            </w:pPr>
+          </w:p>
+        </w:tc>
+        <w:tc>
+          <w:tcPr>
+            <w:tcW w:w="421" w:type="dxa"/>
+            <w:vMerge w:val="restart"/>
+            <w:tcBorders>
+              <w:left w:val="single" w:sz="2" w:space="0" w:color="000000"/>
               <w:bottom w:val="single" w:sz="2" w:space="0" w:color="000000"/>
             </w:tcBorders>
           </w:tcPr>
@@ -8258,7 +8318,25 @@
         </w:tc>
         <w:tc>
           <w:tcPr>
-            <w:tcW w:w="358" w:type="dxa"/>
+            <w:tcW w:w="368" w:type="dxa"/>
+            <w:vMerge w:val="restart"/>
+            <w:tcBorders>
+              <w:bottom w:val="single" w:sz="2" w:space="0" w:color="000000"/>
+            </w:tcBorders>
+          </w:tcPr>
+          <w:p>
+            <w:pPr>
+              <w:pStyle w:val="TableParagraph"/>
+              <w:jc w:val="both"/>
+              <w:rPr>
+                <w:sz w:val="24"/>
+              </w:rPr>
+            </w:pPr>
+          </w:p>
+        </w:tc>
+        <w:tc>
+          <w:tcPr>
+            <w:tcW w:w="362" w:type="dxa"/>
             <w:vMerge w:val="restart"/>
             <w:tcBorders>
               <w:bottom w:val="single" w:sz="2" w:space="0" w:color="000000"/>
@@ -8277,7 +8355,7 @@
         </w:tc>
         <w:tc>
           <w:tcPr>
-            <w:tcW w:w="358" w:type="dxa"/>
+            <w:tcW w:w="369" w:type="dxa"/>
             <w:vMerge w:val="restart"/>
             <w:tcBorders>
               <w:left w:val="single" w:sz="2" w:space="0" w:color="000000"/>
@@ -8296,7 +8374,7 @@
         </w:tc>
         <w:tc>
           <w:tcPr>
-            <w:tcW w:w="310" w:type="dxa"/>
+            <w:tcW w:w="332" w:type="dxa"/>
             <w:vMerge w:val="restart"/>
             <w:tcBorders>
               <w:bottom w:val="single" w:sz="2" w:space="0" w:color="000000"/>
@@ -8314,7 +8392,7 @@
         </w:tc>
         <w:tc>
           <w:tcPr>
-            <w:tcW w:w="315" w:type="dxa"/>
+            <w:tcW w:w="485" w:type="dxa"/>
             <w:vMerge w:val="restart"/>
             <w:tcBorders>
               <w:bottom w:val="single" w:sz="2" w:space="0" w:color="000000"/>
@@ -8332,29 +8410,27 @@
         </w:tc>
         <w:tc>
           <w:tcPr>
-            <w:tcW w:w="313" w:type="dxa"/>
+            <w:tcW w:w="482" w:type="dxa"/>
             <w:vMerge w:val="restart"/>
             <w:tcBorders>
               <w:bottom w:val="single" w:sz="2" w:space="0" w:color="000000"/>
-              <w:right w:val="single" w:sz="2" w:space="0" w:color="000000"/>
-            </w:tcBorders>
-          </w:tcPr>
-          <w:p>
-            <w:pPr>
-              <w:pStyle w:val="TableParagraph"/>
-              <w:jc w:val="both"/>
-              <w:rPr>
-                <w:sz w:val="24"/>
-              </w:rPr>
-            </w:pPr>
-          </w:p>
-        </w:tc>
-        <w:tc>
-          <w:tcPr>
-            <w:tcW w:w="311" w:type="dxa"/>
+            </w:tcBorders>
+          </w:tcPr>
+          <w:p>
+            <w:pPr>
+              <w:pStyle w:val="TableParagraph"/>
+              <w:jc w:val="both"/>
+              <w:rPr>
+                <w:sz w:val="24"/>
+              </w:rPr>
+            </w:pPr>
+          </w:p>
+        </w:tc>
+        <w:tc>
+          <w:tcPr>
+            <w:tcW w:w="470" w:type="dxa"/>
             <w:vMerge w:val="restart"/>
             <w:tcBorders>
-              <w:left w:val="single" w:sz="2" w:space="0" w:color="000000"/>
               <w:bottom w:val="single" w:sz="2" w:space="0" w:color="000000"/>
             </w:tcBorders>
           </w:tcPr>
@@ -8370,7 +8446,7 @@
         </w:tc>
         <w:tc>
           <w:tcPr>
-            <w:tcW w:w="287" w:type="dxa"/>
+            <w:tcW w:w="462" w:type="dxa"/>
             <w:vMerge w:val="restart"/>
             <w:tcBorders>
               <w:bottom w:val="single" w:sz="2" w:space="0" w:color="000000"/>
@@ -8388,79 +8464,7 @@
         </w:tc>
         <w:tc>
           <w:tcPr>
-            <w:tcW w:w="417" w:type="dxa"/>
-            <w:vMerge w:val="restart"/>
-            <w:tcBorders>
-              <w:bottom w:val="single" w:sz="2" w:space="0" w:color="000000"/>
-            </w:tcBorders>
-          </w:tcPr>
-          <w:p>
-            <w:pPr>
-              <w:pStyle w:val="TableParagraph"/>
-              <w:jc w:val="both"/>
-              <w:rPr>
-                <w:sz w:val="24"/>
-              </w:rPr>
-            </w:pPr>
-          </w:p>
-        </w:tc>
-        <w:tc>
-          <w:tcPr>
-            <w:tcW w:w="415" w:type="dxa"/>
-            <w:vMerge w:val="restart"/>
-            <w:tcBorders>
-              <w:bottom w:val="single" w:sz="2" w:space="0" w:color="000000"/>
-            </w:tcBorders>
-          </w:tcPr>
-          <w:p>
-            <w:pPr>
-              <w:pStyle w:val="TableParagraph"/>
-              <w:jc w:val="both"/>
-              <w:rPr>
-                <w:sz w:val="24"/>
-              </w:rPr>
-            </w:pPr>
-          </w:p>
-        </w:tc>
-        <w:tc>
-          <w:tcPr>
-            <w:tcW w:w="393" w:type="dxa"/>
-            <w:vMerge w:val="restart"/>
-            <w:tcBorders>
-              <w:bottom w:val="single" w:sz="2" w:space="0" w:color="000000"/>
-            </w:tcBorders>
-          </w:tcPr>
-          <w:p>
-            <w:pPr>
-              <w:pStyle w:val="TableParagraph"/>
-              <w:jc w:val="both"/>
-              <w:rPr>
-                <w:sz w:val="24"/>
-              </w:rPr>
-            </w:pPr>
-          </w:p>
-        </w:tc>
-        <w:tc>
-          <w:tcPr>
-            <w:tcW w:w="393" w:type="dxa"/>
-            <w:vMerge w:val="restart"/>
-            <w:tcBorders>
-              <w:bottom w:val="single" w:sz="2" w:space="0" w:color="000000"/>
-            </w:tcBorders>
-          </w:tcPr>
-          <w:p>
-            <w:pPr>
-              <w:pStyle w:val="TableParagraph"/>
-              <w:jc w:val="both"/>
-              <w:rPr>
-                <w:sz w:val="24"/>
-              </w:rPr>
-            </w:pPr>
-          </w:p>
-        </w:tc>
-        <w:tc>
-          <w:tcPr>
-            <w:tcW w:w="788" w:type="dxa"/>
+            <w:tcW w:w="920" w:type="dxa"/>
             <w:gridSpan w:val="2"/>
             <w:tcBorders>
               <w:top w:val="nil"/>
@@ -8480,7 +8484,7 @@
         </w:tc>
         <w:tc>
           <w:tcPr>
-            <w:tcW w:w="392" w:type="dxa"/>
+            <w:tcW w:w="455" w:type="dxa"/>
             <w:vMerge w:val="restart"/>
             <w:tcBorders>
               <w:bottom w:val="single" w:sz="48" w:space="0" w:color="000000"/>
@@ -8499,11 +8503,13 @@
       </w:tr>
       <w:tr>
         <w:trPr>
-          <w:trHeight w:val="1137"/>
+          <w:gridAfter w:val="1"/>
+          <w:wAfter w:w="59" w:type="dxa"/>
+          <w:trHeight w:val="1094"/>
         </w:trPr>
         <w:tc>
           <w:tcPr>
-            <w:tcW w:w="3027" w:type="dxa"/>
+            <w:tcW w:w="3544" w:type="dxa"/>
             <w:vMerge/>
             <w:tcBorders>
               <w:top w:val="nil"/>
@@ -8522,7 +8528,7 @@
         </w:tc>
         <w:tc>
           <w:tcPr>
-            <w:tcW w:w="360" w:type="dxa"/>
+            <w:tcW w:w="417" w:type="dxa"/>
             <w:vMerge/>
             <w:tcBorders>
               <w:top w:val="nil"/>
@@ -8541,6 +8547,65 @@
         </w:tc>
         <w:tc>
           <w:tcPr>
+            <w:tcW w:w="415" w:type="dxa"/>
+            <w:vMerge/>
+            <w:tcBorders>
+              <w:top w:val="nil"/>
+              <w:bottom w:val="single" w:sz="2" w:space="0" w:color="000000"/>
+            </w:tcBorders>
+          </w:tcPr>
+          <w:p>
+            <w:pPr>
+              <w:jc w:val="both"/>
+              <w:rPr>
+                <w:sz w:val="2"/>
+                <w:szCs w:val="2"/>
+              </w:rPr>
+            </w:pPr>
+          </w:p>
+        </w:tc>
+        <w:tc>
+          <w:tcPr>
+            <w:tcW w:w="422" w:type="dxa"/>
+            <w:vMerge/>
+            <w:tcBorders>
+              <w:top w:val="nil"/>
+              <w:bottom w:val="single" w:sz="2" w:space="0" w:color="000000"/>
+              <w:right w:val="single" w:sz="2" w:space="0" w:color="000000"/>
+            </w:tcBorders>
+          </w:tcPr>
+          <w:p>
+            <w:pPr>
+              <w:jc w:val="both"/>
+              <w:rPr>
+                <w:sz w:val="2"/>
+                <w:szCs w:val="2"/>
+              </w:rPr>
+            </w:pPr>
+          </w:p>
+        </w:tc>
+        <w:tc>
+          <w:tcPr>
+            <w:tcW w:w="421" w:type="dxa"/>
+            <w:vMerge/>
+            <w:tcBorders>
+              <w:top w:val="nil"/>
+              <w:left w:val="single" w:sz="2" w:space="0" w:color="000000"/>
+              <w:bottom w:val="single" w:sz="2" w:space="0" w:color="000000"/>
+            </w:tcBorders>
+          </w:tcPr>
+          <w:p>
+            <w:pPr>
+              <w:jc w:val="both"/>
+              <w:rPr>
+                <w:sz w:val="2"/>
+                <w:szCs w:val="2"/>
+              </w:rPr>
+            </w:pPr>
+          </w:p>
+        </w:tc>
+        <w:tc>
+          <w:tcPr>
             <w:tcW w:w="358" w:type="dxa"/>
             <w:vMerge/>
             <w:tcBorders>
@@ -8560,7 +8625,26 @@
         </w:tc>
         <w:tc>
           <w:tcPr>
-            <w:tcW w:w="358" w:type="dxa"/>
+            <w:tcW w:w="368" w:type="dxa"/>
+            <w:vMerge/>
+            <w:tcBorders>
+              <w:top w:val="nil"/>
+              <w:bottom w:val="single" w:sz="2" w:space="0" w:color="000000"/>
+            </w:tcBorders>
+          </w:tcPr>
+          <w:p>
+            <w:pPr>
+              <w:jc w:val="both"/>
+              <w:rPr>
+                <w:sz w:val="2"/>
+                <w:szCs w:val="2"/>
+              </w:rPr>
+            </w:pPr>
+          </w:p>
+        </w:tc>
+        <w:tc>
+          <w:tcPr>
+            <w:tcW w:w="362" w:type="dxa"/>
             <w:vMerge/>
             <w:tcBorders>
               <w:top w:val="nil"/>
@@ -8580,7 +8664,7 @@
         </w:tc>
         <w:tc>
           <w:tcPr>
-            <w:tcW w:w="358" w:type="dxa"/>
+            <w:tcW w:w="369" w:type="dxa"/>
             <w:vMerge/>
             <w:tcBorders>
               <w:top w:val="nil"/>
@@ -8600,7 +8684,7 @@
         </w:tc>
         <w:tc>
           <w:tcPr>
-            <w:tcW w:w="310" w:type="dxa"/>
+            <w:tcW w:w="332" w:type="dxa"/>
             <w:vMerge/>
             <w:tcBorders>
               <w:top w:val="nil"/>
@@ -8619,7 +8703,7 @@
         </w:tc>
         <w:tc>
           <w:tcPr>
-            <w:tcW w:w="315" w:type="dxa"/>
+            <w:tcW w:w="485" w:type="dxa"/>
             <w:vMerge/>
             <w:tcBorders>
               <w:top w:val="nil"/>
@@ -8638,12 +8722,11 @@
         </w:tc>
         <w:tc>
           <w:tcPr>
-            <w:tcW w:w="313" w:type="dxa"/>
+            <w:tcW w:w="482" w:type="dxa"/>
             <w:vMerge/>
             <w:tcBorders>
               <w:top w:val="nil"/>
               <w:bottom w:val="single" w:sz="2" w:space="0" w:color="000000"/>
-              <w:right w:val="single" w:sz="2" w:space="0" w:color="000000"/>
             </w:tcBorders>
           </w:tcPr>
           <w:p>
@@ -8658,11 +8741,10 @@
         </w:tc>
         <w:tc>
           <w:tcPr>
-            <w:tcW w:w="311" w:type="dxa"/>
+            <w:tcW w:w="470" w:type="dxa"/>
             <w:vMerge/>
             <w:tcBorders>
               <w:top w:val="nil"/>
-              <w:left w:val="single" w:sz="2" w:space="0" w:color="000000"/>
               <w:bottom w:val="single" w:sz="2" w:space="0" w:color="000000"/>
             </w:tcBorders>
           </w:tcPr>
@@ -8678,7 +8760,7 @@
         </w:tc>
         <w:tc>
           <w:tcPr>
-            <w:tcW w:w="287" w:type="dxa"/>
+            <w:tcW w:w="462" w:type="dxa"/>
             <w:vMerge/>
             <w:tcBorders>
               <w:top w:val="nil"/>
@@ -8697,87 +8779,11 @@
         </w:tc>
         <w:tc>
           <w:tcPr>
-            <w:tcW w:w="417" w:type="dxa"/>
-            <w:vMerge/>
+            <w:tcW w:w="458" w:type="dxa"/>
             <w:tcBorders>
               <w:top w:val="nil"/>
               <w:bottom w:val="single" w:sz="2" w:space="0" w:color="000000"/>
             </w:tcBorders>
-          </w:tcPr>
-          <w:p>
-            <w:pPr>
-              <w:jc w:val="both"/>
-              <w:rPr>
-                <w:sz w:val="2"/>
-                <w:szCs w:val="2"/>
-              </w:rPr>
-            </w:pPr>
-          </w:p>
-        </w:tc>
-        <w:tc>
-          <w:tcPr>
-            <w:tcW w:w="415" w:type="dxa"/>
-            <w:vMerge/>
-            <w:tcBorders>
-              <w:top w:val="nil"/>
-              <w:bottom w:val="single" w:sz="2" w:space="0" w:color="000000"/>
-            </w:tcBorders>
-          </w:tcPr>
-          <w:p>
-            <w:pPr>
-              <w:jc w:val="both"/>
-              <w:rPr>
-                <w:sz w:val="2"/>
-                <w:szCs w:val="2"/>
-              </w:rPr>
-            </w:pPr>
-          </w:p>
-        </w:tc>
-        <w:tc>
-          <w:tcPr>
-            <w:tcW w:w="393" w:type="dxa"/>
-            <w:vMerge/>
-            <w:tcBorders>
-              <w:top w:val="nil"/>
-              <w:bottom w:val="single" w:sz="2" w:space="0" w:color="000000"/>
-            </w:tcBorders>
-          </w:tcPr>
-          <w:p>
-            <w:pPr>
-              <w:jc w:val="both"/>
-              <w:rPr>
-                <w:sz w:val="2"/>
-                <w:szCs w:val="2"/>
-              </w:rPr>
-            </w:pPr>
-          </w:p>
-        </w:tc>
-        <w:tc>
-          <w:tcPr>
-            <w:tcW w:w="393" w:type="dxa"/>
-            <w:vMerge/>
-            <w:tcBorders>
-              <w:top w:val="nil"/>
-              <w:bottom w:val="single" w:sz="2" w:space="0" w:color="000000"/>
-            </w:tcBorders>
-          </w:tcPr>
-          <w:p>
-            <w:pPr>
-              <w:jc w:val="both"/>
-              <w:rPr>
-                <w:sz w:val="2"/>
-                <w:szCs w:val="2"/>
-              </w:rPr>
-            </w:pPr>
-          </w:p>
-        </w:tc>
-        <w:tc>
-          <w:tcPr>
-            <w:tcW w:w="395" w:type="dxa"/>
-            <w:tcBorders>
-              <w:top w:val="nil"/>
-              <w:bottom w:val="single" w:sz="2" w:space="0" w:color="000000"/>
-            </w:tcBorders>
             <w:shd w:val="clear" w:color="auto" w:fill="B45F05"/>
           </w:tcPr>
           <w:p>
@@ -8792,7 +8798,7 @@
         </w:tc>
         <w:tc>
           <w:tcPr>
-            <w:tcW w:w="393" w:type="dxa"/>
+            <w:tcW w:w="462" w:type="dxa"/>
             <w:tcBorders>
               <w:top w:val="nil"/>
               <w:bottom w:val="nil"/>
@@ -8811,7 +8817,7 @@
         </w:tc>
         <w:tc>
           <w:tcPr>
-            <w:tcW w:w="392" w:type="dxa"/>
+            <w:tcW w:w="455" w:type="dxa"/>
             <w:vMerge/>
             <w:tcBorders>
               <w:top w:val="nil"/>
@@ -8831,11 +8837,13 @@
       </w:tr>
       <w:tr>
         <w:trPr>
-          <w:trHeight w:val="33"/>
+          <w:gridAfter w:val="1"/>
+          <w:wAfter w:w="59" w:type="dxa"/>
+          <w:trHeight w:val="27"/>
         </w:trPr>
         <w:tc>
           <w:tcPr>
-            <w:tcW w:w="3027" w:type="dxa"/>
+            <w:tcW w:w="3544" w:type="dxa"/>
             <w:vMerge w:val="restart"/>
             <w:tcBorders>
               <w:top w:val="single" w:sz="2" w:space="0" w:color="000000"/>
@@ -8881,10 +8889,66 @@
         </w:tc>
         <w:tc>
           <w:tcPr>
-            <w:tcW w:w="360" w:type="dxa"/>
+            <w:tcW w:w="417" w:type="dxa"/>
             <w:vMerge w:val="restart"/>
             <w:tcBorders>
               <w:top w:val="single" w:sz="2" w:space="0" w:color="000000"/>
+            </w:tcBorders>
+          </w:tcPr>
+          <w:p>
+            <w:pPr>
+              <w:pStyle w:val="TableParagraph"/>
+              <w:jc w:val="both"/>
+              <w:rPr>
+                <w:sz w:val="24"/>
+              </w:rPr>
+            </w:pPr>
+          </w:p>
+        </w:tc>
+        <w:tc>
+          <w:tcPr>
+            <w:tcW w:w="415" w:type="dxa"/>
+            <w:vMerge w:val="restart"/>
+            <w:tcBorders>
+              <w:top w:val="single" w:sz="2" w:space="0" w:color="000000"/>
+            </w:tcBorders>
+          </w:tcPr>
+          <w:p>
+            <w:pPr>
+              <w:pStyle w:val="TableParagraph"/>
+              <w:jc w:val="both"/>
+              <w:rPr>
+                <w:sz w:val="24"/>
+              </w:rPr>
+            </w:pPr>
+          </w:p>
+        </w:tc>
+        <w:tc>
+          <w:tcPr>
+            <w:tcW w:w="422" w:type="dxa"/>
+            <w:vMerge w:val="restart"/>
+            <w:tcBorders>
+              <w:top w:val="single" w:sz="2" w:space="0" w:color="000000"/>
+              <w:right w:val="single" w:sz="2" w:space="0" w:color="000000"/>
+            </w:tcBorders>
+          </w:tcPr>
+          <w:p>
+            <w:pPr>
+              <w:pStyle w:val="TableParagraph"/>
+              <w:jc w:val="both"/>
+              <w:rPr>
+                <w:sz w:val="24"/>
+              </w:rPr>
+            </w:pPr>
+          </w:p>
+        </w:tc>
+        <w:tc>
+          <w:tcPr>
+            <w:tcW w:w="421" w:type="dxa"/>
+            <w:vMerge w:val="restart"/>
+            <w:tcBorders>
+              <w:top w:val="single" w:sz="2" w:space="0" w:color="000000"/>
+              <w:left w:val="single" w:sz="2" w:space="0" w:color="000000"/>
             </w:tcBorders>
           </w:tcPr>
           <w:p>
@@ -8917,7 +8981,25 @@
         </w:tc>
         <w:tc>
           <w:tcPr>
-            <w:tcW w:w="358" w:type="dxa"/>
+            <w:tcW w:w="368" w:type="dxa"/>
+            <w:vMerge w:val="restart"/>
+            <w:tcBorders>
+              <w:top w:val="single" w:sz="2" w:space="0" w:color="000000"/>
+            </w:tcBorders>
+          </w:tcPr>
+          <w:p>
+            <w:pPr>
+              <w:pStyle w:val="TableParagraph"/>
+              <w:jc w:val="both"/>
+              <w:rPr>
+                <w:sz w:val="24"/>
+              </w:rPr>
+            </w:pPr>
+          </w:p>
+        </w:tc>
+        <w:tc>
+          <w:tcPr>
+            <w:tcW w:w="362" w:type="dxa"/>
             <w:vMerge w:val="restart"/>
             <w:tcBorders>
               <w:top w:val="single" w:sz="2" w:space="0" w:color="000000"/>
@@ -8936,7 +9018,7 @@
         </w:tc>
         <w:tc>
           <w:tcPr>
-            <w:tcW w:w="358" w:type="dxa"/>
+            <w:tcW w:w="369" w:type="dxa"/>
             <w:vMerge w:val="restart"/>
             <w:tcBorders>
               <w:top w:val="single" w:sz="2" w:space="0" w:color="000000"/>
@@ -8955,7 +9037,7 @@
         </w:tc>
         <w:tc>
           <w:tcPr>
-            <w:tcW w:w="310" w:type="dxa"/>
+            <w:tcW w:w="332" w:type="dxa"/>
             <w:vMerge w:val="restart"/>
             <w:tcBorders>
               <w:top w:val="single" w:sz="2" w:space="0" w:color="000000"/>
@@ -8973,7 +9055,7 @@
         </w:tc>
         <w:tc>
           <w:tcPr>
-            <w:tcW w:w="315" w:type="dxa"/>
+            <w:tcW w:w="485" w:type="dxa"/>
             <w:vMerge w:val="restart"/>
             <w:tcBorders>
               <w:top w:val="single" w:sz="2" w:space="0" w:color="000000"/>
@@ -8991,45 +9073,43 @@
         </w:tc>
         <w:tc>
           <w:tcPr>
-            <w:tcW w:w="313" w:type="dxa"/>
+            <w:tcW w:w="482" w:type="dxa"/>
             <w:vMerge w:val="restart"/>
             <w:tcBorders>
               <w:top w:val="single" w:sz="2" w:space="0" w:color="000000"/>
-              <w:right w:val="single" w:sz="2" w:space="0" w:color="000000"/>
-            </w:tcBorders>
-          </w:tcPr>
-          <w:p>
-            <w:pPr>
-              <w:pStyle w:val="TableParagraph"/>
-              <w:jc w:val="both"/>
-              <w:rPr>
-                <w:sz w:val="24"/>
-              </w:rPr>
-            </w:pPr>
-          </w:p>
-        </w:tc>
-        <w:tc>
-          <w:tcPr>
-            <w:tcW w:w="311" w:type="dxa"/>
+            </w:tcBorders>
+          </w:tcPr>
+          <w:p>
+            <w:pPr>
+              <w:pStyle w:val="TableParagraph"/>
+              <w:jc w:val="both"/>
+              <w:rPr>
+                <w:sz w:val="24"/>
+              </w:rPr>
+            </w:pPr>
+          </w:p>
+        </w:tc>
+        <w:tc>
+          <w:tcPr>
+            <w:tcW w:w="470" w:type="dxa"/>
             <w:vMerge w:val="restart"/>
             <w:tcBorders>
               <w:top w:val="single" w:sz="2" w:space="0" w:color="000000"/>
-              <w:left w:val="single" w:sz="2" w:space="0" w:color="000000"/>
-            </w:tcBorders>
-          </w:tcPr>
-          <w:p>
-            <w:pPr>
-              <w:pStyle w:val="TableParagraph"/>
-              <w:jc w:val="both"/>
-              <w:rPr>
-                <w:sz w:val="24"/>
-              </w:rPr>
-            </w:pPr>
-          </w:p>
-        </w:tc>
-        <w:tc>
-          <w:tcPr>
-            <w:tcW w:w="287" w:type="dxa"/>
+            </w:tcBorders>
+          </w:tcPr>
+          <w:p>
+            <w:pPr>
+              <w:pStyle w:val="TableParagraph"/>
+              <w:jc w:val="both"/>
+              <w:rPr>
+                <w:sz w:val="24"/>
+              </w:rPr>
+            </w:pPr>
+          </w:p>
+        </w:tc>
+        <w:tc>
+          <w:tcPr>
+            <w:tcW w:w="462" w:type="dxa"/>
             <w:vMerge w:val="restart"/>
             <w:tcBorders>
               <w:top w:val="single" w:sz="2" w:space="0" w:color="000000"/>
@@ -9047,7 +9127,7 @@
         </w:tc>
         <w:tc>
           <w:tcPr>
-            <w:tcW w:w="417" w:type="dxa"/>
+            <w:tcW w:w="458" w:type="dxa"/>
             <w:vMerge w:val="restart"/>
             <w:tcBorders>
               <w:top w:val="single" w:sz="2" w:space="0" w:color="000000"/>
@@ -9065,79 +9145,7 @@
         </w:tc>
         <w:tc>
           <w:tcPr>
-            <w:tcW w:w="415" w:type="dxa"/>
-            <w:vMerge w:val="restart"/>
-            <w:tcBorders>
-              <w:top w:val="single" w:sz="2" w:space="0" w:color="000000"/>
-            </w:tcBorders>
-          </w:tcPr>
-          <w:p>
-            <w:pPr>
-              <w:pStyle w:val="TableParagraph"/>
-              <w:jc w:val="both"/>
-              <w:rPr>
-                <w:sz w:val="24"/>
-              </w:rPr>
-            </w:pPr>
-          </w:p>
-        </w:tc>
-        <w:tc>
-          <w:tcPr>
-            <w:tcW w:w="393" w:type="dxa"/>
-            <w:vMerge w:val="restart"/>
-            <w:tcBorders>
-              <w:top w:val="single" w:sz="2" w:space="0" w:color="000000"/>
-            </w:tcBorders>
-          </w:tcPr>
-          <w:p>
-            <w:pPr>
-              <w:pStyle w:val="TableParagraph"/>
-              <w:jc w:val="both"/>
-              <w:rPr>
-                <w:sz w:val="24"/>
-              </w:rPr>
-            </w:pPr>
-          </w:p>
-        </w:tc>
-        <w:tc>
-          <w:tcPr>
-            <w:tcW w:w="393" w:type="dxa"/>
-            <w:vMerge w:val="restart"/>
-            <w:tcBorders>
-              <w:top w:val="single" w:sz="2" w:space="0" w:color="000000"/>
-            </w:tcBorders>
-          </w:tcPr>
-          <w:p>
-            <w:pPr>
-              <w:pStyle w:val="TableParagraph"/>
-              <w:jc w:val="both"/>
-              <w:rPr>
-                <w:sz w:val="24"/>
-              </w:rPr>
-            </w:pPr>
-          </w:p>
-        </w:tc>
-        <w:tc>
-          <w:tcPr>
-            <w:tcW w:w="395" w:type="dxa"/>
-            <w:vMerge w:val="restart"/>
-            <w:tcBorders>
-              <w:top w:val="single" w:sz="2" w:space="0" w:color="000000"/>
-            </w:tcBorders>
-          </w:tcPr>
-          <w:p>
-            <w:pPr>
-              <w:pStyle w:val="TableParagraph"/>
-              <w:jc w:val="both"/>
-              <w:rPr>
-                <w:sz w:val="24"/>
-              </w:rPr>
-            </w:pPr>
-          </w:p>
-        </w:tc>
-        <w:tc>
-          <w:tcPr>
-            <w:tcW w:w="785" w:type="dxa"/>
+            <w:tcW w:w="917" w:type="dxa"/>
             <w:gridSpan w:val="2"/>
             <w:tcBorders>
               <w:top w:val="nil"/>
@@ -9158,11 +9166,13 @@
       </w:tr>
       <w:tr>
         <w:trPr>
-          <w:trHeight w:val="1216"/>
+          <w:gridAfter w:val="1"/>
+          <w:wAfter w:w="59" w:type="dxa"/>
+          <w:trHeight w:val="1171"/>
         </w:trPr>
         <w:tc>
           <w:tcPr>
-            <w:tcW w:w="3027" w:type="dxa"/>
+            <w:tcW w:w="3544" w:type="dxa"/>
             <w:vMerge/>
             <w:tcBorders>
               <w:top w:val="nil"/>
@@ -9180,7 +9190,7 @@
         </w:tc>
         <w:tc>
           <w:tcPr>
-            <w:tcW w:w="360" w:type="dxa"/>
+            <w:tcW w:w="417" w:type="dxa"/>
             <w:vMerge/>
             <w:tcBorders>
               <w:top w:val="nil"/>
@@ -9198,6 +9208,62 @@
         </w:tc>
         <w:tc>
           <w:tcPr>
+            <w:tcW w:w="415" w:type="dxa"/>
+            <w:vMerge/>
+            <w:tcBorders>
+              <w:top w:val="nil"/>
+            </w:tcBorders>
+          </w:tcPr>
+          <w:p>
+            <w:pPr>
+              <w:jc w:val="both"/>
+              <w:rPr>
+                <w:sz w:val="2"/>
+                <w:szCs w:val="2"/>
+              </w:rPr>
+            </w:pPr>
+          </w:p>
+        </w:tc>
+        <w:tc>
+          <w:tcPr>
+            <w:tcW w:w="422" w:type="dxa"/>
+            <w:vMerge/>
+            <w:tcBorders>
+              <w:top w:val="nil"/>
+              <w:right w:val="single" w:sz="2" w:space="0" w:color="000000"/>
+            </w:tcBorders>
+          </w:tcPr>
+          <w:p>
+            <w:pPr>
+              <w:jc w:val="both"/>
+              <w:rPr>
+                <w:sz w:val="2"/>
+                <w:szCs w:val="2"/>
+              </w:rPr>
+            </w:pPr>
+          </w:p>
+        </w:tc>
+        <w:tc>
+          <w:tcPr>
+            <w:tcW w:w="421" w:type="dxa"/>
+            <w:vMerge/>
+            <w:tcBorders>
+              <w:top w:val="nil"/>
+              <w:left w:val="single" w:sz="2" w:space="0" w:color="000000"/>
+            </w:tcBorders>
+          </w:tcPr>
+          <w:p>
+            <w:pPr>
+              <w:jc w:val="both"/>
+              <w:rPr>
+                <w:sz w:val="2"/>
+                <w:szCs w:val="2"/>
+              </w:rPr>
+            </w:pPr>
+          </w:p>
+        </w:tc>
+        <w:tc>
+          <w:tcPr>
             <w:tcW w:w="358" w:type="dxa"/>
             <w:vMerge/>
             <w:tcBorders>
@@ -9216,11 +9282,10 @@
         </w:tc>
         <w:tc>
           <w:tcPr>
-            <w:tcW w:w="358" w:type="dxa"/>
+            <w:tcW w:w="368" w:type="dxa"/>
             <w:vMerge/>
             <w:tcBorders>
               <w:top w:val="nil"/>
-              <w:right w:val="single" w:sz="2" w:space="0" w:color="000000"/>
             </w:tcBorders>
           </w:tcPr>
           <w:p>
@@ -9235,11 +9300,11 @@
         </w:tc>
         <w:tc>
           <w:tcPr>
-            <w:tcW w:w="358" w:type="dxa"/>
+            <w:tcW w:w="362" w:type="dxa"/>
             <w:vMerge/>
             <w:tcBorders>
               <w:top w:val="nil"/>
-              <w:left w:val="single" w:sz="2" w:space="0" w:color="000000"/>
+              <w:right w:val="single" w:sz="2" w:space="0" w:color="000000"/>
             </w:tcBorders>
           </w:tcPr>
           <w:p>
@@ -9254,10 +9319,11 @@
         </w:tc>
         <w:tc>
           <w:tcPr>
-            <w:tcW w:w="310" w:type="dxa"/>
+            <w:tcW w:w="369" w:type="dxa"/>
             <w:vMerge/>
             <w:tcBorders>
               <w:top w:val="nil"/>
+              <w:left w:val="single" w:sz="2" w:space="0" w:color="000000"/>
             </w:tcBorders>
           </w:tcPr>
           <w:p>
@@ -9272,7 +9338,7 @@
         </w:tc>
         <w:tc>
           <w:tcPr>
-            <w:tcW w:w="315" w:type="dxa"/>
+            <w:tcW w:w="332" w:type="dxa"/>
             <w:vMerge/>
             <w:tcBorders>
               <w:top w:val="nil"/>
@@ -9290,11 +9356,10 @@
         </w:tc>
         <w:tc>
           <w:tcPr>
-            <w:tcW w:w="313" w:type="dxa"/>
+            <w:tcW w:w="485" w:type="dxa"/>
             <w:vMerge/>
             <w:tcBorders>
               <w:top w:val="nil"/>
-              <w:right w:val="single" w:sz="2" w:space="0" w:color="000000"/>
             </w:tcBorders>
           </w:tcPr>
           <w:p>
@@ -9309,11 +9374,10 @@
         </w:tc>
         <w:tc>
           <w:tcPr>
-            <w:tcW w:w="311" w:type="dxa"/>
+            <w:tcW w:w="482" w:type="dxa"/>
             <w:vMerge/>
             <w:tcBorders>
               <w:top w:val="nil"/>
-              <w:left w:val="single" w:sz="2" w:space="0" w:color="000000"/>
             </w:tcBorders>
           </w:tcPr>
           <w:p>
@@ -9328,7 +9392,7 @@
         </w:tc>
         <w:tc>
           <w:tcPr>
-            <w:tcW w:w="287" w:type="dxa"/>
+            <w:tcW w:w="470" w:type="dxa"/>
             <w:vMerge/>
             <w:tcBorders>
               <w:top w:val="nil"/>
@@ -9346,7 +9410,7 @@
         </w:tc>
         <w:tc>
           <w:tcPr>
-            <w:tcW w:w="417" w:type="dxa"/>
+            <w:tcW w:w="462" w:type="dxa"/>
             <w:vMerge/>
             <w:tcBorders>
               <w:top w:val="nil"/>
@@ -9364,7 +9428,7 @@
         </w:tc>
         <w:tc>
           <w:tcPr>
-            <w:tcW w:w="415" w:type="dxa"/>
+            <w:tcW w:w="458" w:type="dxa"/>
             <w:vMerge/>
             <w:tcBorders>
               <w:top w:val="nil"/>
@@ -9382,61 +9446,7 @@
         </w:tc>
         <w:tc>
           <w:tcPr>
-            <w:tcW w:w="393" w:type="dxa"/>
-            <w:vMerge/>
-            <w:tcBorders>
-              <w:top w:val="nil"/>
-            </w:tcBorders>
-          </w:tcPr>
-          <w:p>
-            <w:pPr>
-              <w:jc w:val="both"/>
-              <w:rPr>
-                <w:sz w:val="2"/>
-                <w:szCs w:val="2"/>
-              </w:rPr>
-            </w:pPr>
-          </w:p>
-        </w:tc>
-        <w:tc>
-          <w:tcPr>
-            <w:tcW w:w="393" w:type="dxa"/>
-            <w:vMerge/>
-            <w:tcBorders>
-              <w:top w:val="nil"/>
-            </w:tcBorders>
-          </w:tcPr>
-          <w:p>
-            <w:pPr>
-              <w:jc w:val="both"/>
-              <w:rPr>
-                <w:sz w:val="2"/>
-                <w:szCs w:val="2"/>
-              </w:rPr>
-            </w:pPr>
-          </w:p>
-        </w:tc>
-        <w:tc>
-          <w:tcPr>
-            <w:tcW w:w="395" w:type="dxa"/>
-            <w:vMerge/>
-            <w:tcBorders>
-              <w:top w:val="nil"/>
-            </w:tcBorders>
-          </w:tcPr>
-          <w:p>
-            <w:pPr>
-              <w:jc w:val="both"/>
-              <w:rPr>
-                <w:sz w:val="2"/>
-                <w:szCs w:val="2"/>
-              </w:rPr>
-            </w:pPr>
-          </w:p>
-        </w:tc>
-        <w:tc>
-          <w:tcPr>
-            <w:tcW w:w="393" w:type="dxa"/>
+            <w:tcW w:w="462" w:type="dxa"/>
             <w:tcBorders>
               <w:top w:val="nil"/>
             </w:tcBorders>
@@ -9454,7 +9464,7 @@
         </w:tc>
         <w:tc>
           <w:tcPr>
-            <w:tcW w:w="392" w:type="dxa"/>
+            <w:tcW w:w="455" w:type="dxa"/>
             <w:tcBorders>
               <w:top w:val="nil"/>
             </w:tcBorders>
@@ -9480,9 +9490,9 @@
           <w:sz w:val="24"/>
         </w:rPr>
         <w:sectPr>
-          <w:headerReference w:type="default" r:id="rId8"/>
+          <w:headerReference w:type="default" r:id="rId9"/>
           <w:pgSz w:w="12240" w:h="15840"/>
-          <w:pgMar w:top="2060" w:right="360" w:bottom="280" w:left="0" w:header="1121" w:footer="0" w:gutter="0"/>
+          <w:pgMar w:top="2060" w:right="360" w:bottom="280" w:left="567" w:header="1121" w:footer="0" w:gutter="0"/>
           <w:cols w:space="720"/>
         </w:sectPr>
       </w:pPr>
@@ -9596,6 +9606,14 @@
           <w:sz w:val="24"/>
         </w:rPr>
         <w:t>Information</w:t>
+      </w:r>
+      <w:r>
+        <w:rPr>
+          <w:b/>
+          <w:spacing w:val="-2"/>
+          <w:sz w:val="24"/>
+        </w:rPr>
+        <w:t xml:space="preserve"> </w:t>
       </w:r>
     </w:p>
     <w:p>
@@ -9635,7 +9653,7 @@
     <w:p>
       <w:pPr>
         <w:tabs>
-          <w:tab w:val="left" w:pos="1572"/>
+          <w:tab w:val="left" w:pos="1560"/>
         </w:tabs>
         <w:spacing w:before="43"/>
         <w:ind w:firstLine="851"/>
@@ -9678,10 +9696,10 @@
     <w:p>
       <w:pPr>
         <w:tabs>
-          <w:tab w:val="left" w:pos="360"/>
+          <w:tab w:val="left" w:pos="567"/>
         </w:tabs>
         <w:spacing w:before="43"/>
-        <w:ind w:right="8894" w:firstLine="1134"/>
+        <w:ind w:firstLine="1560"/>
         <w:jc w:val="both"/>
         <w:rPr>
           <w:sz w:val="24"/>
@@ -9689,16 +9707,8 @@
       </w:pPr>
       <w:r>
         <w:rPr>
-          <w:spacing w:val="-10"/>
-          <w:sz w:val="24"/>
-        </w:rPr>
-        <w:t>−</w:t>
-      </w:r>
-      <w:r>
-        <w:rPr>
-          <w:sz w:val="24"/>
-        </w:rPr>
-        <w:tab/>
+          <w:sz w:val="24"/>
+        </w:rPr>
         <w:t>Time:</w:t>
       </w:r>
       <w:r>
@@ -10317,7 +10327,7 @@
         <w:jc w:val="both"/>
         <w:sectPr>
           <w:pgSz w:w="12240" w:h="15840"/>
-          <w:pgMar w:top="2060" w:right="360" w:bottom="280" w:left="0" w:header="1121" w:footer="0" w:gutter="0"/>
+          <w:pgMar w:top="2060" w:right="360" w:bottom="280" w:left="567" w:header="1121" w:footer="0" w:gutter="0"/>
           <w:cols w:space="720"/>
         </w:sectPr>
       </w:pPr>
@@ -10357,7 +10367,7 @@
                     <pic:cNvPicPr/>
                   </pic:nvPicPr>
                   <pic:blipFill>
-                    <a:blip r:embed="rId9" cstate="print"/>
+                    <a:blip r:embed="rId10" cstate="print"/>
                     <a:stretch>
                       <a:fillRect/>
                     </a:stretch>
@@ -10406,7 +10416,7 @@
                     <pic:cNvPicPr/>
                   </pic:nvPicPr>
                   <pic:blipFill>
-                    <a:blip r:embed="rId10" cstate="print"/>
+                    <a:blip r:embed="rId11" cstate="print"/>
                     <a:stretch>
                       <a:fillRect/>
                     </a:stretch>
@@ -10454,7 +10464,7 @@
                     <pic:cNvPicPr/>
                   </pic:nvPicPr>
                   <pic:blipFill>
-                    <a:blip r:embed="rId11" cstate="print"/>
+                    <a:blip r:embed="rId12" cstate="print"/>
                     <a:stretch>
                       <a:fillRect/>
                     </a:stretch>
@@ -10676,9 +10686,9 @@
         <w:spacing w:line="249" w:lineRule="auto"/>
         <w:jc w:val="both"/>
         <w:sectPr>
-          <w:headerReference w:type="default" r:id="rId12"/>
+          <w:headerReference w:type="default" r:id="rId13"/>
           <w:pgSz w:w="12240" w:h="15840"/>
-          <w:pgMar w:top="780" w:right="360" w:bottom="280" w:left="0" w:header="0" w:footer="0" w:gutter="0"/>
+          <w:pgMar w:top="780" w:right="360" w:bottom="280" w:left="567" w:header="0" w:footer="0" w:gutter="0"/>
           <w:cols w:space="720"/>
         </w:sectPr>
       </w:pPr>
@@ -10718,7 +10728,7 @@
                     <pic:cNvPicPr/>
                   </pic:nvPicPr>
                   <pic:blipFill>
-                    <a:blip r:embed="rId9" cstate="print"/>
+                    <a:blip r:embed="rId10" cstate="print"/>
                     <a:stretch>
                       <a:fillRect/>
                     </a:stretch>
@@ -10767,7 +10777,7 @@
                     <pic:cNvPicPr/>
                   </pic:nvPicPr>
                   <pic:blipFill>
-                    <a:blip r:embed="rId10" cstate="print"/>
+                    <a:blip r:embed="rId11" cstate="print"/>
                     <a:stretch>
                       <a:fillRect/>
                     </a:stretch>
@@ -10815,7 +10825,7 @@
                     <pic:cNvPicPr/>
                   </pic:nvPicPr>
                   <pic:blipFill>
-                    <a:blip r:embed="rId11" cstate="print"/>
+                    <a:blip r:embed="rId12" cstate="print"/>
                     <a:stretch>
                       <a:fillRect/>
                     </a:stretch>
@@ -10916,9 +10926,9 @@
       </w:r>
     </w:p>
     <w:sectPr>
-      <w:headerReference w:type="default" r:id="rId13"/>
+      <w:headerReference w:type="default" r:id="rId14"/>
       <w:pgSz w:w="12240" w:h="15840"/>
-      <w:pgMar w:top="780" w:right="360" w:bottom="280" w:left="0" w:header="0" w:footer="0" w:gutter="0"/>
+      <w:pgMar w:top="780" w:right="360" w:bottom="280" w:left="567" w:header="0" w:footer="0" w:gutter="0"/>
       <w:cols w:space="720"/>
     </w:sectPr>
   </w:body>
@@ -11348,6 +11358,126 @@
     </w:pPr>
   </w:p>
 </w:hdr>
+</file>
+
+<file path=word/numbering.xml><?xml version="1.0" encoding="utf-8"?>
+<w:numbering xmlns:wpc="http://schemas.microsoft.com/office/word/2010/wordprocessingCanvas" xmlns:cx="http://schemas.microsoft.com/office/drawing/2014/chartex" xmlns:cx1="http://schemas.microsoft.com/office/drawing/2015/9/8/chartex" xmlns:cx2="http://schemas.microsoft.com/office/drawing/2015/10/21/chartex" xmlns:cx3="http://schemas.microsoft.com/office/drawing/2016/5/9/chartex" xmlns:cx4="http://schemas.microsoft.com/office/drawing/2016/5/10/chartex" xmlns:cx5="http://schemas.microsoft.com/office/drawing/2016/5/11/chartex" xmlns:cx6="http://schemas.microsoft.com/office/drawing/2016/5/12/chartex" xmlns:cx7="http://schemas.microsoft.com/office/drawing/2016/5/13/chartex" xmlns:cx8="http://schemas.microsoft.com/office/drawing/2016/5/14/chartex" xmlns:mc="http://schemas.openxmlformats.org/markup-compatibility/2006" xmlns:aink="http://schemas.microsoft.com/office/drawing/2016/ink" xmlns:am3d="http://schemas.microsoft.com/office/drawing/2017/model3d" xmlns:o="urn:schemas-microsoft-com:office:office" xmlns:oel="http://schemas.microsoft.com/office/2019/extlst" xmlns:r="http://schemas.openxmlformats.org/officeDocument/2006/relationships" xmlns:m="http://schemas.openxmlformats.org/officeDocument/2006/math" xmlns:v="urn:schemas-microsoft-com:vml" xmlns:wp14="http://schemas.microsoft.com/office/word/2010/wordprocessingDrawing" xmlns:wp="http://schemas.openxmlformats.org/drawingml/2006/wordprocessingDrawing" xmlns:w10="urn:schemas-microsoft-com:office:word" xmlns:w="http://schemas.openxmlformats.org/wordprocessingml/2006/main" xmlns:w14="http://schemas.microsoft.com/office/word/2010/wordml" xmlns:w15="http://schemas.microsoft.com/office/word/2012/wordml" xmlns:w16cei="http://schemas.microsoft.com/office/word/2026/wordml/cei" xmlns:w16cex="http://schemas.microsoft.com/office/word/2018/wordml/cex" xmlns:w16cid="http://schemas.microsoft.com/office/word/2016/wordml/cid" xmlns:w16="http://schemas.microsoft.com/office/word/2018/wordml" xmlns:w16du="http://schemas.microsoft.com/office/word/2023/wordml/word16du" xmlns:w16sdtdh="http://schemas.microsoft.com/office/word/2020/wordml/sdtdatahash" xmlns:w16sdtfl="http://schemas.microsoft.com/office/word/2024/wordml/sdtformatlock" xmlns:w16se="http://schemas.microsoft.com/office/word/2015/wordml/symex" xmlns:wpg="http://schemas.microsoft.com/office/word/2010/wordprocessingGroup" xmlns:wpi="http://schemas.microsoft.com/office/word/2010/wordprocessingInk" xmlns:wne="http://schemas.microsoft.com/office/word/2006/wordml" xmlns:wps="http://schemas.microsoft.com/office/word/2010/wordprocessingShape" mc:Ignorable="w14 w15 w16se w16cid w16 w16cex w16sdtdh w16sdtfl w16du wp14">
+  <w:abstractNum w:abstractNumId="0" w15:restartNumberingAfterBreak="0">
+    <w:nsid w:val="72475786"/>
+    <w:multiLevelType w:val="hybridMultilevel"/>
+    <w:tmpl w:val="D00846F2"/>
+    <w:lvl w:ilvl="0" w:tplc="4FD2BE36">
+      <w:numFmt w:val="bullet"/>
+      <w:lvlText w:val="-"/>
+      <w:lvlJc w:val="left"/>
+      <w:pPr>
+        <w:ind w:left="1636" w:hanging="360"/>
+      </w:pPr>
+      <w:rPr>
+        <w:rFonts w:ascii="Times New Roman" w:eastAsia="Times New Roman" w:hAnsi="Times New Roman" w:cs="Times New Roman" w:hint="default"/>
+      </w:rPr>
+    </w:lvl>
+    <w:lvl w:ilvl="1" w:tplc="40090003" w:tentative="1">
+      <w:start w:val="1"/>
+      <w:numFmt w:val="bullet"/>
+      <w:lvlText w:val="o"/>
+      <w:lvlJc w:val="left"/>
+      <w:pPr>
+        <w:ind w:left="2356" w:hanging="360"/>
+      </w:pPr>
+      <w:rPr>
+        <w:rFonts w:ascii="Courier New" w:hAnsi="Courier New" w:cs="Courier New" w:hint="default"/>
+      </w:rPr>
+    </w:lvl>
+    <w:lvl w:ilvl="2" w:tplc="40090005" w:tentative="1">
+      <w:start w:val="1"/>
+      <w:numFmt w:val="bullet"/>
+      <w:lvlText w:val=""/>
+      <w:lvlJc w:val="left"/>
+      <w:pPr>
+        <w:ind w:left="3076" w:hanging="360"/>
+      </w:pPr>
+      <w:rPr>
+        <w:rFonts w:ascii="Wingdings" w:hAnsi="Wingdings" w:hint="default"/>
+      </w:rPr>
+    </w:lvl>
+    <w:lvl w:ilvl="3" w:tplc="40090001" w:tentative="1">
+      <w:start w:val="1"/>
+      <w:numFmt w:val="bullet"/>
+      <w:lvlText w:val=""/>
+      <w:lvlJc w:val="left"/>
+      <w:pPr>
+        <w:ind w:left="3796" w:hanging="360"/>
+      </w:pPr>
+      <w:rPr>
+        <w:rFonts w:ascii="Symbol" w:hAnsi="Symbol" w:hint="default"/>
+      </w:rPr>
+    </w:lvl>
+    <w:lvl w:ilvl="4" w:tplc="40090003" w:tentative="1">
+      <w:start w:val="1"/>
+      <w:numFmt w:val="bullet"/>
+      <w:lvlText w:val="o"/>
+      <w:lvlJc w:val="left"/>
+      <w:pPr>
+        <w:ind w:left="4516" w:hanging="360"/>
+      </w:pPr>
+      <w:rPr>
+        <w:rFonts w:ascii="Courier New" w:hAnsi="Courier New" w:cs="Courier New" w:hint="default"/>
+      </w:rPr>
+    </w:lvl>
+    <w:lvl w:ilvl="5" w:tplc="40090005" w:tentative="1">
+      <w:start w:val="1"/>
+      <w:numFmt w:val="bullet"/>
+      <w:lvlText w:val=""/>
+      <w:lvlJc w:val="left"/>
+      <w:pPr>
+        <w:ind w:left="5236" w:hanging="360"/>
+      </w:pPr>
+      <w:rPr>
+        <w:rFonts w:ascii="Wingdings" w:hAnsi="Wingdings" w:hint="default"/>
+      </w:rPr>
+    </w:lvl>
+    <w:lvl w:ilvl="6" w:tplc="40090001" w:tentative="1">
+      <w:start w:val="1"/>
+      <w:numFmt w:val="bullet"/>
+      <w:lvlText w:val=""/>
+      <w:lvlJc w:val="left"/>
+      <w:pPr>
+        <w:ind w:left="5956" w:hanging="360"/>
+      </w:pPr>
+      <w:rPr>
+        <w:rFonts w:ascii="Symbol" w:hAnsi="Symbol" w:hint="default"/>
+      </w:rPr>
+    </w:lvl>
+    <w:lvl w:ilvl="7" w:tplc="40090003" w:tentative="1">
+      <w:start w:val="1"/>
+      <w:numFmt w:val="bullet"/>
+      <w:lvlText w:val="o"/>
+      <w:lvlJc w:val="left"/>
+      <w:pPr>
+        <w:ind w:left="6676" w:hanging="360"/>
+      </w:pPr>
+      <w:rPr>
+        <w:rFonts w:ascii="Courier New" w:hAnsi="Courier New" w:cs="Courier New" w:hint="default"/>
+      </w:rPr>
+    </w:lvl>
+    <w:lvl w:ilvl="8" w:tplc="40090005" w:tentative="1">
+      <w:start w:val="1"/>
+      <w:numFmt w:val="bullet"/>
+      <w:lvlText w:val=""/>
+      <w:lvlJc w:val="left"/>
+      <w:pPr>
+        <w:ind w:left="7396" w:hanging="360"/>
+      </w:pPr>
+      <w:rPr>
+        <w:rFonts w:ascii="Wingdings" w:hAnsi="Wingdings" w:hint="default"/>
+      </w:rPr>
+    </w:lvl>
+  </w:abstractNum>
+  <w:num w:numId="1" w16cid:durableId="287274706">
+    <w:abstractNumId w:val="0"/>
+  </w:num>
+</w:numbering>
 </file>
 
 <file path=word/styles.xml><?xml version="1.0" encoding="utf-8"?>

</xml_diff>